<commit_message>
new file:   xuetangx/Taiji Starts From Scratch(Bilingual Vertion)(Round 10).md 	modified:   "\320\232\320\270\321\202\320\260\320\271\321\201\320\272\320\270\320\265_\320\276\320\261\321\200\320\260\320\267\320\276\320\262\320\260\321\202\320\265\320\273\321\214\320\275\321\213\320\265_\320\277\320\273\320\260\321\202\321\204\320\276\321\200\320\274\321\213.docx"
</commit_message>
<xml_diff>
--- a/Китайские_образовательные_платформы.docx
+++ b/Китайские_образовательные_платформы.docx
@@ -4,7 +4,65 @@
   <w:body>
     <w:p>
       <w:pPr>
-        <w:spacing w:before="6000"/>
+        <w:spacing w:line="360" w:lineRule="auto"/>
+        <w:jc w:val="both"/>
+        <w:rPr>
+          <w:lang w:val="en-US"/>
+        </w:rPr>
+      </w:pPr>
+    </w:p>
+    <w:p>
+      <w:pPr>
+        <w:spacing w:line="360" w:lineRule="auto"/>
+        <w:jc w:val="both"/>
+        <w:rPr>
+          <w:lang w:val="en-US"/>
+        </w:rPr>
+      </w:pPr>
+    </w:p>
+    <w:p>
+      <w:pPr>
+        <w:spacing w:line="360" w:lineRule="auto"/>
+        <w:jc w:val="both"/>
+        <w:rPr>
+          <w:lang w:val="en-US"/>
+        </w:rPr>
+      </w:pPr>
+    </w:p>
+    <w:p>
+      <w:pPr>
+        <w:spacing w:line="360" w:lineRule="auto"/>
+        <w:jc w:val="both"/>
+        <w:rPr>
+          <w:lang w:val="en-US"/>
+        </w:rPr>
+      </w:pPr>
+    </w:p>
+    <w:p>
+      <w:pPr>
+        <w:spacing w:line="360" w:lineRule="auto"/>
+        <w:jc w:val="both"/>
+        <w:rPr>
+          <w:lang w:val="en-US"/>
+        </w:rPr>
+      </w:pPr>
+    </w:p>
+    <w:p>
+      <w:pPr>
+        <w:spacing w:line="360" w:lineRule="auto"/>
+        <w:jc w:val="both"/>
+        <w:rPr>
+          <w:lang w:val="en-US"/>
+        </w:rPr>
+      </w:pPr>
+    </w:p>
+    <w:p>
+      <w:pPr>
+        <w:spacing w:line="360" w:lineRule="auto"/>
+        <w:jc w:val="both"/>
+        <w:rPr>
+          <w:lang w:val="en-US"/>
+        </w:rPr>
       </w:pPr>
     </w:p>
     <w:p>
@@ -43,32 +101,50 @@
       <w:pPr>
         <w:spacing w:after="200"/>
         <w:jc w:val="center"/>
-      </w:pPr>
-      <w:r>
         <w:rPr>
           <w:i/>
           <w:iCs/>
           <w:color w:val="6B6361"/>
         </w:rPr>
+      </w:pPr>
+      <w:r>
+        <w:rPr>
+          <w:i/>
+          <w:iCs/>
+          <w:color w:val="6B6361"/>
+        </w:rPr>
         <w:t>Методическое пособие для авторов образовательного контента</w:t>
       </w:r>
     </w:p>
     <w:p>
       <w:pPr>
-        <w:spacing w:after="200"/>
+        <w:spacing w:line="360" w:lineRule="auto"/>
+        <w:jc w:val="both"/>
+      </w:pPr>
+    </w:p>
+    <w:p>
+      <w:pPr>
+        <w:spacing w:line="360" w:lineRule="auto"/>
+        <w:jc w:val="both"/>
+      </w:pPr>
+    </w:p>
+    <w:p>
+      <w:pPr>
+        <w:spacing w:line="360" w:lineRule="auto"/>
+        <w:jc w:val="both"/>
       </w:pPr>
       <w:r>
         <w:rPr>
           <w:noProof/>
         </w:rPr>
         <w:drawing>
-          <wp:anchor distT="0" distB="0" distL="114300" distR="114300" simplePos="0" relativeHeight="251659264" behindDoc="0" locked="0" layoutInCell="1" allowOverlap="1" wp14:anchorId="1322EE50" wp14:editId="7925466E">
+          <wp:anchor distT="0" distB="0" distL="114300" distR="114300" simplePos="0" relativeHeight="251659264" behindDoc="0" locked="0" layoutInCell="1" allowOverlap="1" wp14:anchorId="1322EE50" wp14:editId="2650815A">
             <wp:simplePos x="0" y="0"/>
             <wp:positionH relativeFrom="column">
-              <wp:posOffset>6438900</wp:posOffset>
+              <wp:posOffset>6481233</wp:posOffset>
             </wp:positionH>
             <wp:positionV relativeFrom="paragraph">
-              <wp:posOffset>132715</wp:posOffset>
+              <wp:posOffset>183938</wp:posOffset>
             </wp:positionV>
             <wp:extent cx="918210" cy="1303280"/>
             <wp:effectExtent l="133350" t="76200" r="72390" b="125730"/>
@@ -85,7 +161,7 @@
                     <pic:cNvPicPr/>
                   </pic:nvPicPr>
                   <pic:blipFill rotWithShape="1">
-                    <a:blip r:embed="rId7"/>
+                    <a:blip r:embed="rId8"/>
                     <a:srcRect t="20161"/>
                     <a:stretch/>
                   </pic:blipFill>
@@ -136,22 +212,32 @@
     </w:p>
     <w:p>
       <w:pPr>
-        <w:spacing w:after="200"/>
-      </w:pPr>
-    </w:p>
-    <w:p>
-      <w:pPr>
-        <w:spacing w:after="200"/>
-      </w:pPr>
-    </w:p>
-    <w:p>
-      <w:pPr>
-        <w:spacing w:after="200"/>
-      </w:pPr>
-    </w:p>
-    <w:p>
-      <w:pPr>
-        <w:spacing w:after="200"/>
+        <w:spacing w:line="360" w:lineRule="auto"/>
+        <w:jc w:val="both"/>
+      </w:pPr>
+    </w:p>
+    <w:p>
+      <w:pPr>
+        <w:spacing w:line="360" w:lineRule="auto"/>
+        <w:jc w:val="both"/>
+      </w:pPr>
+    </w:p>
+    <w:p>
+      <w:pPr>
+        <w:spacing w:line="360" w:lineRule="auto"/>
+        <w:jc w:val="both"/>
+      </w:pPr>
+    </w:p>
+    <w:p>
+      <w:pPr>
+        <w:spacing w:line="360" w:lineRule="auto"/>
+        <w:jc w:val="both"/>
+      </w:pPr>
+    </w:p>
+    <w:p>
+      <w:pPr>
+        <w:spacing w:line="360" w:lineRule="auto"/>
+        <w:jc w:val="both"/>
       </w:pPr>
     </w:p>
     <w:p>
@@ -223,7 +309,7 @@
       <w:r>
         <w:t xml:space="preserve"> </w:t>
       </w:r>
-      <w:hyperlink r:id="rId8" w:history="1">
+      <w:hyperlink r:id="rId9" w:history="1">
         <w:r>
           <w:rPr>
             <w:rStyle w:val="a5"/>
@@ -253,7 +339,7 @@
       <w:r>
         <w:t xml:space="preserve"> </w:t>
       </w:r>
-      <w:hyperlink r:id="rId9" w:history="1">
+      <w:hyperlink r:id="rId10" w:history="1">
         <w:r>
           <w:rPr>
             <w:rStyle w:val="a5"/>
@@ -262,16 +348,69 @@
         </w:r>
       </w:hyperlink>
     </w:p>
-    <w:p/>
-    <w:p/>
-    <w:p/>
-    <w:p/>
-    <w:p/>
-    <w:p/>
-    <w:p/>
-    <w:p/>
-    <w:p>
-      <w:pPr>
+    <w:p>
+      <w:pPr>
+        <w:spacing w:line="360" w:lineRule="auto"/>
+      </w:pPr>
+    </w:p>
+    <w:p>
+      <w:pPr>
+        <w:spacing w:line="360" w:lineRule="auto"/>
+      </w:pPr>
+    </w:p>
+    <w:p>
+      <w:pPr>
+        <w:spacing w:line="360" w:lineRule="auto"/>
+      </w:pPr>
+    </w:p>
+    <w:p>
+      <w:pPr>
+        <w:spacing w:line="360" w:lineRule="auto"/>
+      </w:pPr>
+    </w:p>
+    <w:p>
+      <w:pPr>
+        <w:spacing w:line="360" w:lineRule="auto"/>
+      </w:pPr>
+    </w:p>
+    <w:p>
+      <w:pPr>
+        <w:spacing w:line="360" w:lineRule="auto"/>
+      </w:pPr>
+    </w:p>
+    <w:p>
+      <w:pPr>
+        <w:spacing w:line="360" w:lineRule="auto"/>
+      </w:pPr>
+    </w:p>
+    <w:p>
+      <w:pPr>
+        <w:spacing w:line="360" w:lineRule="auto"/>
+      </w:pPr>
+    </w:p>
+    <w:p>
+      <w:pPr>
+        <w:spacing w:line="360" w:lineRule="auto"/>
+      </w:pPr>
+    </w:p>
+    <w:p>
+      <w:pPr>
+        <w:spacing w:line="360" w:lineRule="auto"/>
+      </w:pPr>
+    </w:p>
+    <w:p>
+      <w:pPr>
+        <w:spacing w:line="360" w:lineRule="auto"/>
+      </w:pPr>
+    </w:p>
+    <w:p>
+      <w:pPr>
+        <w:spacing w:line="360" w:lineRule="auto"/>
+      </w:pPr>
+    </w:p>
+    <w:p>
+      <w:pPr>
+        <w:spacing w:line="360" w:lineRule="auto"/>
         <w:jc w:val="center"/>
       </w:pPr>
       <w:r>
@@ -280,21 +419,24 @@
           <w:sz w:val="22"/>
           <w:szCs w:val="22"/>
         </w:rPr>
-        <w:t>16.03.2026</w:t>
-      </w:r>
-    </w:p>
-    <w:p>
-      <w:pPr>
-        <w:rPr>
-          <w:lang w:val="en-US"/>
-        </w:rPr>
-      </w:pPr>
-    </w:p>
-    <w:p>
-      <w:pPr>
-        <w:rPr>
-          <w:lang w:val="en-US"/>
-        </w:rPr>
+        <w:t xml:space="preserve">Москва </w:t>
+      </w:r>
+      <w:r>
+        <w:rPr>
+          <w:color w:val="6B6361"/>
+          <w:sz w:val="22"/>
+          <w:szCs w:val="22"/>
+        </w:rPr>
+        <w:t>2026</w:t>
+      </w:r>
+    </w:p>
+    <w:p>
+      <w:pPr>
+        <w:spacing w:line="360" w:lineRule="auto"/>
+      </w:pPr>
+    </w:p>
+    <w:p>
+      <w:pPr>
         <w:sectPr>
           <w:pgSz w:w="11906" w:h="16838"/>
           <w:pgMar w:top="0" w:right="0" w:bottom="0" w:left="0" w:header="708" w:footer="708" w:gutter="0"/>
@@ -310,7 +452,6 @@
         <w:rPr>
           <w:sz w:val="28"/>
           <w:szCs w:val="28"/>
-          <w:lang w:val="en-US"/>
         </w:rPr>
       </w:pPr>
       <w:bookmarkStart w:id="0" w:name="_Toc224571151"/>
@@ -329,19 +470,15 @@
         <w:spacing w:line="360" w:lineRule="auto"/>
         <w:ind w:firstLine="709"/>
         <w:jc w:val="both"/>
-        <w:rPr>
-          <w:lang w:val="en-US"/>
-        </w:rPr>
-      </w:pPr>
-    </w:p>
-    <w:p>
-      <w:pPr>
-        <w:spacing w:line="360" w:lineRule="auto"/>
-        <w:ind w:firstLine="709"/>
-        <w:jc w:val="both"/>
-        <w:rPr>
-          <w:color w:val="3D3735"/>
-          <w:lang w:val="en-US"/>
+      </w:pPr>
+    </w:p>
+    <w:p>
+      <w:pPr>
+        <w:spacing w:line="360" w:lineRule="auto"/>
+        <w:ind w:firstLine="709"/>
+        <w:jc w:val="both"/>
+        <w:rPr>
+          <w:color w:val="3D3735"/>
         </w:rPr>
       </w:pPr>
       <w:r>
@@ -358,21 +495,24 @@
         <w:jc w:val="both"/>
         <w:rPr>
           <w:color w:val="3D3735"/>
-          <w:lang w:val="en-US"/>
-        </w:rPr>
-      </w:pPr>
-    </w:p>
-    <w:p>
-      <w:pPr>
-        <w:spacing w:line="360" w:lineRule="auto"/>
-        <w:ind w:firstLine="709"/>
-        <w:jc w:val="both"/>
-        <w:rPr>
-          <w:color w:val="3D3735"/>
-        </w:rPr>
-      </w:pPr>
-      <w:r>
-        <w:rPr>
+        </w:rPr>
+      </w:pPr>
+    </w:p>
+    <w:p>
+      <w:pPr>
+        <w:spacing w:line="360" w:lineRule="auto"/>
+        <w:ind w:firstLine="709"/>
+        <w:jc w:val="both"/>
+        <w:rPr>
+          <w:b/>
+          <w:bCs/>
+          <w:color w:val="3D3735"/>
+        </w:rPr>
+      </w:pPr>
+      <w:r>
+        <w:rPr>
+          <w:b/>
+          <w:bCs/>
           <w:color w:val="3D3735"/>
         </w:rPr>
         <w:t>Для каждой платформы приведены её характеристики, целевая аудитория, требования к контенту и процесс публикации.</w:t>
@@ -385,7 +525,6 @@
         <w:jc w:val="both"/>
         <w:rPr>
           <w:color w:val="3D3735"/>
-          <w:lang w:val="en-US"/>
         </w:rPr>
       </w:pPr>
     </w:p>
@@ -419,7 +558,6 @@
         <w:jc w:val="both"/>
         <w:rPr>
           <w:color w:val="3D3735"/>
-          <w:lang w:val="en-US"/>
         </w:rPr>
       </w:pPr>
       <w:r>
@@ -430,24 +568,206 @@
         </w:rPr>
         <w:t xml:space="preserve">Ключевые слова: </w:t>
       </w:r>
-      <w:r>
-        <w:rPr>
-          <w:color w:val="3D3735"/>
-        </w:rPr>
-        <w:t>ONLINE EDUCATION, CHINA, EDTECH, MOOC, COURSE PUBLICATION, YUANFUDAO, XUETANGX, QUANTASING, ICOURE, SMART EDUCATION PLATFORM</w:t>
-      </w:r>
-    </w:p>
-    <w:p>
-      <w:pPr>
-        <w:rPr>
-          <w:color w:val="3D3735"/>
-          <w:lang w:val="en-US"/>
-        </w:rPr>
-      </w:pPr>
-      <w:r>
-        <w:rPr>
-          <w:color w:val="3D3735"/>
-          <w:lang w:val="en-US"/>
+      <w:proofErr w:type="spellStart"/>
+      <w:r>
+        <w:rPr>
+          <w:color w:val="3D3735"/>
+        </w:rPr>
+        <w:t>online</w:t>
+      </w:r>
+      <w:proofErr w:type="spellEnd"/>
+      <w:r>
+        <w:rPr>
+          <w:color w:val="3D3735"/>
+        </w:rPr>
+        <w:t xml:space="preserve"> </w:t>
+      </w:r>
+      <w:proofErr w:type="spellStart"/>
+      <w:r>
+        <w:rPr>
+          <w:color w:val="3D3735"/>
+        </w:rPr>
+        <w:t>education</w:t>
+      </w:r>
+      <w:proofErr w:type="spellEnd"/>
+      <w:r>
+        <w:rPr>
+          <w:color w:val="3D3735"/>
+        </w:rPr>
+        <w:t xml:space="preserve">, </w:t>
+      </w:r>
+      <w:proofErr w:type="spellStart"/>
+      <w:r>
+        <w:rPr>
+          <w:color w:val="3D3735"/>
+        </w:rPr>
+        <w:t>china</w:t>
+      </w:r>
+      <w:proofErr w:type="spellEnd"/>
+      <w:r>
+        <w:rPr>
+          <w:color w:val="3D3735"/>
+        </w:rPr>
+        <w:t xml:space="preserve">, </w:t>
+      </w:r>
+      <w:proofErr w:type="spellStart"/>
+      <w:r>
+        <w:rPr>
+          <w:color w:val="3D3735"/>
+        </w:rPr>
+        <w:t>edtech</w:t>
+      </w:r>
+      <w:proofErr w:type="spellEnd"/>
+      <w:r>
+        <w:rPr>
+          <w:color w:val="3D3735"/>
+        </w:rPr>
+        <w:t xml:space="preserve">, </w:t>
+      </w:r>
+      <w:proofErr w:type="spellStart"/>
+      <w:r>
+        <w:rPr>
+          <w:color w:val="3D3735"/>
+        </w:rPr>
+        <w:t>mooc</w:t>
+      </w:r>
+      <w:proofErr w:type="spellEnd"/>
+      <w:r>
+        <w:rPr>
+          <w:color w:val="3D3735"/>
+        </w:rPr>
+        <w:t xml:space="preserve">, </w:t>
+      </w:r>
+      <w:proofErr w:type="spellStart"/>
+      <w:r>
+        <w:rPr>
+          <w:color w:val="3D3735"/>
+        </w:rPr>
+        <w:t>course</w:t>
+      </w:r>
+      <w:proofErr w:type="spellEnd"/>
+      <w:r>
+        <w:rPr>
+          <w:color w:val="3D3735"/>
+        </w:rPr>
+        <w:t xml:space="preserve"> </w:t>
+      </w:r>
+      <w:proofErr w:type="spellStart"/>
+      <w:r>
+        <w:rPr>
+          <w:color w:val="3D3735"/>
+        </w:rPr>
+        <w:t>publication</w:t>
+      </w:r>
+      <w:proofErr w:type="spellEnd"/>
+      <w:r>
+        <w:rPr>
+          <w:color w:val="3D3735"/>
+        </w:rPr>
+        <w:t xml:space="preserve">, </w:t>
+      </w:r>
+      <w:proofErr w:type="spellStart"/>
+      <w:r>
+        <w:rPr>
+          <w:color w:val="3D3735"/>
+        </w:rPr>
+        <w:t>yuanfudao</w:t>
+      </w:r>
+      <w:proofErr w:type="spellEnd"/>
+      <w:r>
+        <w:rPr>
+          <w:color w:val="3D3735"/>
+        </w:rPr>
+        <w:t xml:space="preserve">, </w:t>
+      </w:r>
+      <w:proofErr w:type="spellStart"/>
+      <w:r>
+        <w:rPr>
+          <w:color w:val="3D3735"/>
+        </w:rPr>
+        <w:t>xuetangx</w:t>
+      </w:r>
+      <w:proofErr w:type="spellEnd"/>
+      <w:r>
+        <w:rPr>
+          <w:color w:val="3D3735"/>
+        </w:rPr>
+        <w:t xml:space="preserve">, </w:t>
+      </w:r>
+      <w:proofErr w:type="spellStart"/>
+      <w:r>
+        <w:rPr>
+          <w:color w:val="3D3735"/>
+        </w:rPr>
+        <w:t>quantasing</w:t>
+      </w:r>
+      <w:proofErr w:type="spellEnd"/>
+      <w:r>
+        <w:rPr>
+          <w:color w:val="3D3735"/>
+        </w:rPr>
+        <w:t xml:space="preserve">, </w:t>
+      </w:r>
+      <w:proofErr w:type="spellStart"/>
+      <w:r>
+        <w:rPr>
+          <w:color w:val="3D3735"/>
+        </w:rPr>
+        <w:t>icoure</w:t>
+      </w:r>
+      <w:proofErr w:type="spellEnd"/>
+      <w:r>
+        <w:rPr>
+          <w:color w:val="3D3735"/>
+        </w:rPr>
+        <w:t xml:space="preserve">, </w:t>
+      </w:r>
+      <w:proofErr w:type="spellStart"/>
+      <w:r>
+        <w:rPr>
+          <w:color w:val="3D3735"/>
+        </w:rPr>
+        <w:t>smart</w:t>
+      </w:r>
+      <w:proofErr w:type="spellEnd"/>
+      <w:r>
+        <w:rPr>
+          <w:color w:val="3D3735"/>
+        </w:rPr>
+        <w:t xml:space="preserve"> </w:t>
+      </w:r>
+      <w:proofErr w:type="spellStart"/>
+      <w:r>
+        <w:rPr>
+          <w:color w:val="3D3735"/>
+        </w:rPr>
+        <w:t>education</w:t>
+      </w:r>
+      <w:proofErr w:type="spellEnd"/>
+      <w:r>
+        <w:rPr>
+          <w:color w:val="3D3735"/>
+        </w:rPr>
+        <w:t xml:space="preserve"> </w:t>
+      </w:r>
+      <w:proofErr w:type="spellStart"/>
+      <w:r>
+        <w:rPr>
+          <w:color w:val="3D3735"/>
+        </w:rPr>
+        <w:t>platform</w:t>
+      </w:r>
+      <w:proofErr w:type="spellEnd"/>
+    </w:p>
+    <w:p>
+      <w:pPr>
+        <w:rPr>
+          <w:color w:val="3D3735"/>
+        </w:rPr>
+      </w:pPr>
+      <w:r>
+        <w:rPr>
+          <w:color w:val="3D3735"/>
         </w:rPr>
         <w:br w:type="page"/>
       </w:r>
@@ -460,7 +780,6 @@
         <w:rPr>
           <w:sz w:val="28"/>
           <w:szCs w:val="28"/>
-          <w:lang w:val="en-US"/>
         </w:rPr>
       </w:pPr>
       <w:bookmarkStart w:id="1" w:name="_Toc224571152"/>
@@ -474,13 +793,7 @@
       </w:r>
       <w:bookmarkEnd w:id="1"/>
     </w:p>
-    <w:p>
-      <w:pPr>
-        <w:rPr>
-          <w:lang w:val="en-US"/>
-        </w:rPr>
-      </w:pPr>
-    </w:p>
+    <w:p/>
     <w:sdt>
       <w:sdtPr>
         <w:alias w:val="Содержание"/>
@@ -493,6 +806,8 @@
             <w:tabs>
               <w:tab w:val="right" w:leader="dot" w:pos="9016"/>
             </w:tabs>
+            <w:spacing w:line="360" w:lineRule="auto"/>
+            <w:jc w:val="both"/>
             <w:rPr>
               <w:noProof/>
             </w:rPr>
@@ -563,6 +878,8 @@
             <w:tabs>
               <w:tab w:val="right" w:leader="dot" w:pos="9016"/>
             </w:tabs>
+            <w:spacing w:line="360" w:lineRule="auto"/>
+            <w:jc w:val="both"/>
             <w:rPr>
               <w:noProof/>
             </w:rPr>
@@ -624,6 +941,8 @@
             <w:tabs>
               <w:tab w:val="right" w:leader="dot" w:pos="9016"/>
             </w:tabs>
+            <w:spacing w:line="360" w:lineRule="auto"/>
+            <w:jc w:val="both"/>
             <w:rPr>
               <w:noProof/>
             </w:rPr>
@@ -685,6 +1004,8 @@
             <w:tabs>
               <w:tab w:val="right" w:leader="dot" w:pos="9016"/>
             </w:tabs>
+            <w:spacing w:line="360" w:lineRule="auto"/>
+            <w:jc w:val="both"/>
             <w:rPr>
               <w:noProof/>
             </w:rPr>
@@ -746,6 +1067,8 @@
             <w:tabs>
               <w:tab w:val="right" w:leader="dot" w:pos="9016"/>
             </w:tabs>
+            <w:spacing w:line="360" w:lineRule="auto"/>
+            <w:jc w:val="both"/>
             <w:rPr>
               <w:noProof/>
             </w:rPr>
@@ -807,6 +1130,8 @@
             <w:tabs>
               <w:tab w:val="right" w:leader="dot" w:pos="9016"/>
             </w:tabs>
+            <w:spacing w:line="360" w:lineRule="auto"/>
+            <w:jc w:val="both"/>
             <w:rPr>
               <w:noProof/>
             </w:rPr>
@@ -868,6 +1193,8 @@
             <w:tabs>
               <w:tab w:val="right" w:leader="dot" w:pos="9016"/>
             </w:tabs>
+            <w:spacing w:line="360" w:lineRule="auto"/>
+            <w:jc w:val="both"/>
             <w:rPr>
               <w:noProof/>
             </w:rPr>
@@ -929,6 +1256,8 @@
             <w:tabs>
               <w:tab w:val="right" w:leader="dot" w:pos="9016"/>
             </w:tabs>
+            <w:spacing w:line="360" w:lineRule="auto"/>
+            <w:jc w:val="both"/>
             <w:rPr>
               <w:noProof/>
             </w:rPr>
@@ -990,6 +1319,8 @@
             <w:tabs>
               <w:tab w:val="right" w:leader="dot" w:pos="9016"/>
             </w:tabs>
+            <w:spacing w:line="360" w:lineRule="auto"/>
+            <w:jc w:val="both"/>
             <w:rPr>
               <w:noProof/>
             </w:rPr>
@@ -1051,6 +1382,8 @@
             <w:tabs>
               <w:tab w:val="right" w:leader="dot" w:pos="9016"/>
             </w:tabs>
+            <w:spacing w:line="360" w:lineRule="auto"/>
+            <w:jc w:val="both"/>
             <w:rPr>
               <w:noProof/>
             </w:rPr>
@@ -1112,6 +1445,8 @@
             <w:tabs>
               <w:tab w:val="right" w:leader="dot" w:pos="9016"/>
             </w:tabs>
+            <w:spacing w:line="360" w:lineRule="auto"/>
+            <w:jc w:val="both"/>
             <w:rPr>
               <w:noProof/>
             </w:rPr>
@@ -1173,6 +1508,8 @@
             <w:tabs>
               <w:tab w:val="right" w:leader="dot" w:pos="9016"/>
             </w:tabs>
+            <w:spacing w:line="360" w:lineRule="auto"/>
+            <w:jc w:val="both"/>
             <w:rPr>
               <w:noProof/>
             </w:rPr>
@@ -1234,6 +1571,8 @@
             <w:tabs>
               <w:tab w:val="right" w:leader="dot" w:pos="9016"/>
             </w:tabs>
+            <w:spacing w:line="360" w:lineRule="auto"/>
+            <w:jc w:val="both"/>
             <w:rPr>
               <w:noProof/>
             </w:rPr>
@@ -1295,6 +1634,8 @@
             <w:tabs>
               <w:tab w:val="right" w:leader="dot" w:pos="9016"/>
             </w:tabs>
+            <w:spacing w:line="360" w:lineRule="auto"/>
+            <w:jc w:val="both"/>
             <w:rPr>
               <w:noProof/>
             </w:rPr>
@@ -1356,6 +1697,8 @@
             <w:tabs>
               <w:tab w:val="right" w:leader="dot" w:pos="9016"/>
             </w:tabs>
+            <w:spacing w:line="360" w:lineRule="auto"/>
+            <w:jc w:val="both"/>
             <w:rPr>
               <w:noProof/>
             </w:rPr>
@@ -1417,6 +1760,8 @@
             <w:tabs>
               <w:tab w:val="right" w:leader="dot" w:pos="9016"/>
             </w:tabs>
+            <w:spacing w:line="360" w:lineRule="auto"/>
+            <w:jc w:val="both"/>
             <w:rPr>
               <w:noProof/>
             </w:rPr>
@@ -1478,6 +1823,8 @@
             <w:tabs>
               <w:tab w:val="right" w:leader="dot" w:pos="9016"/>
             </w:tabs>
+            <w:spacing w:line="360" w:lineRule="auto"/>
+            <w:jc w:val="both"/>
             <w:rPr>
               <w:noProof/>
             </w:rPr>
@@ -1534,6 +1881,10 @@
           </w:hyperlink>
         </w:p>
         <w:p>
+          <w:pPr>
+            <w:spacing w:line="360" w:lineRule="auto"/>
+            <w:jc w:val="both"/>
+          </w:pPr>
           <w:r>
             <w:fldChar w:fldCharType="end"/>
           </w:r>
@@ -1655,13 +2006,7 @@
         <w:t>Китайский рынок онлайн-образования претерпел значительные изменения в последние годы, особенно после государственного регулирования сектора K-12 в 2021 году.</w:t>
       </w:r>
     </w:p>
-    <w:p>
-      <w:pPr>
-        <w:rPr>
-          <w:lang w:val="en-US"/>
-        </w:rPr>
-      </w:pPr>
-    </w:p>
+    <w:p/>
     <w:p>
       <w:pPr>
         <w:spacing w:line="360" w:lineRule="auto"/>
@@ -1691,13 +2036,7 @@
         <w:t>Это создаёт уникальные возможности для авторов онлайн-курсов, желающих представить свой контент китайским слушателям.</w:t>
       </w:r>
     </w:p>
-    <w:p>
-      <w:pPr>
-        <w:rPr>
-          <w:lang w:val="en-US"/>
-        </w:rPr>
-      </w:pPr>
-    </w:p>
+    <w:p/>
     <w:p>
       <w:pPr>
         <w:spacing w:line="360" w:lineRule="auto"/>
@@ -1722,13 +2061,7 @@
         <w:t xml:space="preserve"> По данным исследований, в стране насчитывается более 400 миллионов пользователей онлайн-образовательных сервисов, что делает этот рынок одним из крупнейших в мире.</w:t>
       </w:r>
     </w:p>
-    <w:p>
-      <w:pPr>
-        <w:rPr>
-          <w:lang w:val="en-US"/>
-        </w:rPr>
-      </w:pPr>
-    </w:p>
+    <w:p/>
     <w:p>
       <w:pPr>
         <w:spacing w:line="360" w:lineRule="auto"/>
@@ -1753,7 +2086,21 @@
         <w:rPr>
           <w:color w:val="3D3735"/>
         </w:rPr>
-        <w:t xml:space="preserve"> и присвоении ей премии ЮНЕСКО, подтверждает стратегическую важность этого направления для китайского правительства.</w:t>
+        <w:t xml:space="preserve"> и присвоении ей премии </w:t>
+      </w:r>
+      <w:r>
+        <w:rPr>
+          <w:b/>
+          <w:bCs/>
+          <w:color w:val="3D3735"/>
+        </w:rPr>
+        <w:t>ЮНЕСКО</w:t>
+      </w:r>
+      <w:r>
+        <w:rPr>
+          <w:color w:val="3D3735"/>
+        </w:rPr>
+        <w:t>, подтверждает стратегическую важность этого направления для китайского правительства.</w:t>
       </w:r>
     </w:p>
     <w:p/>
@@ -1770,7 +2117,41 @@
         <w:rPr>
           <w:color w:val="3D3735"/>
         </w:rPr>
-        <w:t>Настоящий документ преследует цель систематизировать информацию о ключевых площадках, предоставить их сравнительный анализ и выработать практические рекомендации по эффективной публикации курсов, включая адаптацию контента, выбор платформы и маркетинговые стратегии. Материал будет полезен как индивидуальным авторам, так и образовательным организациям, планирующим экспансию на китайский рынок.</w:t>
+        <w:t>Настоящий документ преследует цель систематизировать информацию о ключевых площадках, предоставить их сравнительный анализ и выработать практические рекомендации по эффективной публикации курсов, включая адаптацию контента, выбор платформы и маркетинговые стратегии.</w:t>
+      </w:r>
+    </w:p>
+    <w:p>
+      <w:pPr>
+        <w:spacing w:line="360" w:lineRule="auto"/>
+        <w:ind w:firstLine="709"/>
+        <w:jc w:val="both"/>
+        <w:rPr>
+          <w:color w:val="3D3735"/>
+        </w:rPr>
+      </w:pPr>
+    </w:p>
+    <w:p>
+      <w:pPr>
+        <w:spacing w:line="360" w:lineRule="auto"/>
+        <w:ind w:firstLine="709"/>
+        <w:jc w:val="both"/>
+        <w:rPr>
+          <w:b/>
+          <w:bCs/>
+          <w:i/>
+          <w:iCs/>
+          <w:color w:val="3D3735"/>
+        </w:rPr>
+      </w:pPr>
+      <w:r>
+        <w:rPr>
+          <w:b/>
+          <w:bCs/>
+          <w:i/>
+          <w:iCs/>
+          <w:color w:val="3D3735"/>
+        </w:rPr>
+        <w:t>Материал будет полезен как индивидуальным авторам, так и образовательным организациям, планирующим экспансию на китайский рынок.</w:t>
       </w:r>
     </w:p>
     <w:p>
@@ -1815,6 +2196,7 @@
     </w:p>
     <w:p>
       <w:pPr>
+        <w:ind w:left="708"/>
         <w:rPr>
           <w:lang w:val="en-US"/>
         </w:rPr>
@@ -1827,6 +2209,8 @@
         <w:ind w:firstLine="709"/>
         <w:jc w:val="both"/>
         <w:rPr>
+          <w:b w:val="0"/>
+          <w:bCs w:val="0"/>
           <w:u w:val="single"/>
         </w:rPr>
       </w:pPr>
@@ -1907,9 +2291,9 @@
     </w:p>
     <w:p>
       <w:pPr>
-        <w:rPr>
-          <w:lang w:val="en-US"/>
-        </w:rPr>
+        <w:spacing w:line="360" w:lineRule="auto"/>
+        <w:ind w:firstLine="709"/>
+        <w:jc w:val="both"/>
       </w:pPr>
     </w:p>
     <w:p>
@@ -1935,21 +2319,20 @@
     </w:p>
     <w:p>
       <w:pPr>
-        <w:rPr>
-          <w:lang w:val="en-US"/>
-        </w:rPr>
-      </w:pPr>
-    </w:p>
-    <w:p>
-      <w:pPr>
-        <w:spacing w:line="360" w:lineRule="auto"/>
-        <w:ind w:firstLine="709"/>
-        <w:jc w:val="both"/>
-        <w:rPr>
-          <w:b/>
-          <w:bCs/>
-          <w:color w:val="3D3735"/>
-          <w:lang w:val="en-US"/>
+        <w:spacing w:line="360" w:lineRule="auto"/>
+        <w:ind w:firstLine="709"/>
+        <w:jc w:val="both"/>
+      </w:pPr>
+    </w:p>
+    <w:p>
+      <w:pPr>
+        <w:spacing w:line="360" w:lineRule="auto"/>
+        <w:ind w:firstLine="709"/>
+        <w:jc w:val="both"/>
+        <w:rPr>
+          <w:b/>
+          <w:bCs/>
+          <w:color w:val="3D3735"/>
         </w:rPr>
       </w:pPr>
       <w:r>
@@ -1963,9 +2346,9 @@
     </w:p>
     <w:p>
       <w:pPr>
-        <w:rPr>
-          <w:lang w:val="en-US"/>
-        </w:rPr>
+        <w:spacing w:line="360" w:lineRule="auto"/>
+        <w:ind w:firstLine="709"/>
+        <w:jc w:val="both"/>
       </w:pPr>
     </w:p>
     <w:p>
@@ -1997,9 +2380,9 @@
     </w:p>
     <w:p>
       <w:pPr>
-        <w:rPr>
-          <w:lang w:val="en-US"/>
-        </w:rPr>
+        <w:spacing w:line="360" w:lineRule="auto"/>
+        <w:ind w:firstLine="709"/>
+        <w:jc w:val="both"/>
       </w:pPr>
     </w:p>
     <w:p>
@@ -2062,9 +2445,9 @@
     </w:p>
     <w:p>
       <w:pPr>
-        <w:rPr>
-          <w:lang w:val="en-US"/>
-        </w:rPr>
+        <w:spacing w:line="360" w:lineRule="auto"/>
+        <w:ind w:firstLine="709"/>
+        <w:jc w:val="both"/>
       </w:pPr>
     </w:p>
     <w:p>
@@ -2083,7 +2466,13 @@
         <w:t>Важной особенностью является наличие международной версии с интерфейсом на английском, русском, испанском, французском и японском языках, что значительно упрощает доступ зарубежных пользователей.</w:t>
       </w:r>
     </w:p>
-    <w:p/>
+    <w:p>
+      <w:pPr>
+        <w:spacing w:line="360" w:lineRule="auto"/>
+        <w:ind w:firstLine="709"/>
+        <w:jc w:val="both"/>
+      </w:pPr>
+    </w:p>
     <w:p>
       <w:pPr>
         <w:spacing w:line="360" w:lineRule="auto"/>
@@ -2132,6 +2521,7 @@
         <w:rPr>
           <w:color w:val="3D3735"/>
         </w:rPr>
+        <w:lastRenderedPageBreak/>
         <w:t xml:space="preserve">Необходимо связаться с администрацией </w:t>
       </w:r>
       <w:proofErr w:type="spellStart"/>
@@ -2164,7 +2554,6 @@
         <w:rPr>
           <w:color w:val="3D3735"/>
         </w:rPr>
-        <w:lastRenderedPageBreak/>
         <w:t>Контент должен соответствовать академическим стандартам и пройти предварительную экспертизу качества</w:t>
       </w:r>
     </w:p>
@@ -2188,6 +2577,7 @@
     </w:p>
     <w:p>
       <w:pPr>
+        <w:ind w:left="708"/>
         <w:rPr>
           <w:lang w:val="en-US"/>
         </w:rPr>
@@ -2199,37 +2589,59 @@
         <w:spacing w:before="0" w:after="0" w:line="360" w:lineRule="auto"/>
         <w:ind w:firstLine="709"/>
         <w:jc w:val="both"/>
+        <w:rPr>
+          <w:b w:val="0"/>
+          <w:bCs w:val="0"/>
+        </w:rPr>
       </w:pPr>
       <w:bookmarkStart w:id="5" w:name="_Toc224571156"/>
       <w:r>
-        <w:t xml:space="preserve">2.2. </w:t>
+        <w:t>2.2. i</w:t>
       </w:r>
       <w:proofErr w:type="spellStart"/>
       <w:r>
+        <w:t>Course</w:t>
+      </w:r>
+      <w:proofErr w:type="spellEnd"/>
+      <w:r>
+        <w:t xml:space="preserve"> International</w:t>
+      </w:r>
+      <w:bookmarkEnd w:id="5"/>
+    </w:p>
+    <w:p>
+      <w:pPr>
+        <w:spacing w:line="360" w:lineRule="auto"/>
+        <w:ind w:firstLine="709"/>
+        <w:jc w:val="both"/>
+        <w:rPr>
+          <w:color w:val="3D3735"/>
+        </w:rPr>
+      </w:pPr>
+      <w:r>
+        <w:rPr>
+          <w:b/>
+          <w:bCs/>
+          <w:color w:val="3D3735"/>
+        </w:rPr>
+        <w:t xml:space="preserve">Международная платформа </w:t>
+      </w:r>
+      <w:proofErr w:type="spellStart"/>
+      <w:r>
+        <w:rPr>
+          <w:b/>
+          <w:bCs/>
+          <w:color w:val="3D3735"/>
+        </w:rPr>
         <w:t>iCourse</w:t>
       </w:r>
       <w:proofErr w:type="spellEnd"/>
       <w:r>
-        <w:t xml:space="preserve"> International</w:t>
-      </w:r>
-      <w:bookmarkEnd w:id="5"/>
-    </w:p>
-    <w:p>
-      <w:pPr>
-        <w:spacing w:line="360" w:lineRule="auto"/>
-        <w:ind w:firstLine="709"/>
-        <w:jc w:val="both"/>
-        <w:rPr>
-          <w:color w:val="3D3735"/>
-        </w:rPr>
-      </w:pPr>
-      <w:r>
-        <w:rPr>
-          <w:b/>
-          <w:bCs/>
-          <w:color w:val="3D3735"/>
-        </w:rPr>
-        <w:t xml:space="preserve">Международная платформа </w:t>
+        <w:rPr>
+          <w:b/>
+          <w:bCs/>
+          <w:color w:val="3D3735"/>
+        </w:rPr>
+        <w:t xml:space="preserve"> International была запущена Издательством высшего образования Китая (</w:t>
       </w:r>
       <w:proofErr w:type="spellStart"/>
       <w:r>
@@ -2238,96 +2650,190 @@
           <w:bCs/>
           <w:color w:val="3D3735"/>
         </w:rPr>
+        <w:t>Higher</w:t>
+      </w:r>
+      <w:proofErr w:type="spellEnd"/>
+      <w:r>
+        <w:rPr>
+          <w:b/>
+          <w:bCs/>
+          <w:color w:val="3D3735"/>
+        </w:rPr>
+        <w:t xml:space="preserve"> Education Press) в апреле 2020 года.</w:t>
+      </w:r>
+      <w:r>
+        <w:rPr>
+          <w:color w:val="3D3735"/>
+        </w:rPr>
+        <w:t xml:space="preserve"> Инициатива возникла в ответ на глобальный спрос на качественное онлайн-образование в период пандемии COVID-19.</w:t>
+      </w:r>
+    </w:p>
+    <w:p>
+      <w:pPr>
+        <w:spacing w:line="360" w:lineRule="auto"/>
+        <w:ind w:firstLine="709"/>
+        <w:jc w:val="both"/>
+      </w:pPr>
+    </w:p>
+    <w:p>
+      <w:pPr>
+        <w:spacing w:line="360" w:lineRule="auto"/>
+        <w:ind w:firstLine="709"/>
+        <w:jc w:val="both"/>
+      </w:pPr>
+      <w:r>
+        <w:rPr>
+          <w:color w:val="3D3735"/>
+        </w:rPr>
+        <w:t>Платформа создана для предоставления образовательных услуг иностранным университетам, преподавателям, студентам и зарубежным китайцам, стремящимся получить доступ к академическим ресурсам Китая.</w:t>
+      </w:r>
+    </w:p>
+    <w:p>
+      <w:pPr>
+        <w:spacing w:line="360" w:lineRule="auto"/>
+        <w:ind w:firstLine="709"/>
+        <w:jc w:val="both"/>
+      </w:pPr>
+    </w:p>
+    <w:p>
+      <w:pPr>
+        <w:spacing w:line="360" w:lineRule="auto"/>
+        <w:ind w:firstLine="709"/>
+        <w:jc w:val="both"/>
+        <w:rPr>
+          <w:color w:val="3D3735"/>
+        </w:rPr>
+      </w:pPr>
+      <w:r>
+        <w:rPr>
+          <w:color w:val="3D3735"/>
+        </w:rPr>
+        <w:t xml:space="preserve">Платформа основана на базе китайской платформы </w:t>
+      </w:r>
+      <w:proofErr w:type="spellStart"/>
+      <w:r>
+        <w:rPr>
+          <w:color w:val="3D3735"/>
+        </w:rPr>
         <w:t>iCourse</w:t>
       </w:r>
       <w:proofErr w:type="spellEnd"/>
       <w:r>
         <w:rPr>
-          <w:b/>
-          <w:bCs/>
-          <w:color w:val="3D3735"/>
-        </w:rPr>
-        <w:t xml:space="preserve"> International была запущена Издательством высшего образования Китая (</w:t>
-      </w:r>
-      <w:proofErr w:type="spellStart"/>
-      <w:r>
-        <w:rPr>
-          <w:b/>
-          <w:bCs/>
-          <w:color w:val="3D3735"/>
-        </w:rPr>
-        <w:t>Higher</w:t>
-      </w:r>
-      <w:proofErr w:type="spellEnd"/>
-      <w:r>
-        <w:rPr>
-          <w:b/>
-          <w:bCs/>
-          <w:color w:val="3D3735"/>
-        </w:rPr>
-        <w:t xml:space="preserve"> Education Press) в апреле 2020 года.</w:t>
-      </w:r>
-      <w:r>
-        <w:rPr>
-          <w:color w:val="3D3735"/>
-        </w:rPr>
-        <w:t xml:space="preserve"> Инициатива возникла в ответ на глобальный спрос на качественное онлайн-образование в период пандемии COVID-19.</w:t>
-      </w:r>
-    </w:p>
-    <w:p>
-      <w:pPr>
-        <w:rPr>
+          <w:color w:val="3D3735"/>
+        </w:rPr>
+        <w:t>, насчитывающей более 9000 MOOC. Первая международная партия включала 193 курса на английском языке, охватывающих медицину, естественные науки, инженерию, сельское хозяйство, экономику, искусство и дизайн, а также инновационное предпринимательство.</w:t>
+      </w:r>
+    </w:p>
+    <w:p>
+      <w:pPr>
+        <w:spacing w:line="360" w:lineRule="auto"/>
+        <w:ind w:firstLine="709"/>
+        <w:jc w:val="both"/>
+      </w:pPr>
+    </w:p>
+    <w:p>
+      <w:pPr>
+        <w:spacing w:line="360" w:lineRule="auto"/>
+        <w:ind w:firstLine="709"/>
+        <w:jc w:val="both"/>
+      </w:pPr>
+      <w:r>
+        <w:rPr>
+          <w:b/>
+          <w:bCs/>
+          <w:color w:val="3D3735"/>
+        </w:rPr>
+        <w:t>Основной язык платформы</w:t>
+      </w:r>
+      <w:r>
+        <w:rPr>
+          <w:color w:val="3D3735"/>
+        </w:rPr>
+        <w:t xml:space="preserve"> — английский, что делает её доступной для глобальной аудитории. В перспективе планируется внедрение версий на других языках.</w:t>
+      </w:r>
+    </w:p>
+    <w:p>
+      <w:pPr>
+        <w:spacing w:line="360" w:lineRule="auto"/>
+        <w:ind w:firstLine="709"/>
+        <w:jc w:val="both"/>
+      </w:pPr>
+    </w:p>
+    <w:p>
+      <w:pPr>
+        <w:spacing w:line="360" w:lineRule="auto"/>
+        <w:ind w:firstLine="709"/>
+        <w:jc w:val="both"/>
+        <w:rPr>
+          <w:b/>
+          <w:bCs/>
+          <w:color w:val="3D3735"/>
+        </w:rPr>
+      </w:pPr>
+      <w:r>
+        <w:rPr>
+          <w:color w:val="3D3735"/>
+        </w:rPr>
+        <w:t xml:space="preserve">Формат обучения предусматривает доступ через персональные компьютеры и мобильные приложения, обеспечивая гибкость для пользователей в различных часовых поясах. </w:t>
+      </w:r>
+      <w:r>
+        <w:rPr>
+          <w:b/>
+          <w:bCs/>
+          <w:color w:val="3D3735"/>
+        </w:rPr>
+        <w:t>Платформа ориентирована на международное сотрудничество, что открывает возможности для зарубежных авторов и образовательных учреждений.</w:t>
+      </w:r>
+    </w:p>
+    <w:p>
+      <w:pPr>
+        <w:spacing w:line="360" w:lineRule="auto"/>
+        <w:ind w:firstLine="709"/>
+        <w:jc w:val="both"/>
+      </w:pPr>
+    </w:p>
+    <w:p>
+      <w:pPr>
+        <w:spacing w:line="360" w:lineRule="auto"/>
+        <w:ind w:firstLine="709"/>
+        <w:jc w:val="both"/>
+        <w:rPr>
+          <w:color w:val="3D3735"/>
           <w:lang w:val="en-US"/>
         </w:rPr>
       </w:pPr>
-    </w:p>
-    <w:p>
-      <w:pPr>
-        <w:spacing w:line="360" w:lineRule="auto"/>
-        <w:ind w:firstLine="709"/>
-        <w:jc w:val="both"/>
-      </w:pPr>
-      <w:r>
-        <w:rPr>
-          <w:color w:val="3D3735"/>
-        </w:rPr>
-        <w:t>Платформа создана для предоставления образовательных услуг иностранным университетам, преподавателям, студентам и зарубежным китайцам, стремящимся получить доступ к академическим ресурсам Китая.</w:t>
-      </w:r>
-    </w:p>
-    <w:p/>
-    <w:p>
-      <w:pPr>
-        <w:spacing w:line="360" w:lineRule="auto"/>
-        <w:ind w:firstLine="709"/>
-        <w:jc w:val="both"/>
-        <w:rPr>
-          <w:color w:val="3D3735"/>
-        </w:rPr>
-      </w:pPr>
-      <w:r>
-        <w:rPr>
-          <w:color w:val="3D3735"/>
-        </w:rPr>
-        <w:t xml:space="preserve">Платформа основана на базе китайской платформы </w:t>
-      </w:r>
-      <w:proofErr w:type="spellStart"/>
-      <w:r>
-        <w:rPr>
-          <w:color w:val="3D3735"/>
-        </w:rPr>
-        <w:t>iCourse</w:t>
-      </w:r>
-      <w:proofErr w:type="spellEnd"/>
-      <w:r>
-        <w:rPr>
-          <w:color w:val="3D3735"/>
-        </w:rPr>
-        <w:t>, насчитывающей более 9000 MOOC. Первая международная партия включала 193 курса на английском языке, охватывающих медицину, естественные науки, инженерию, сельское хозяйство, экономику, искусство и дизайн, а также инновационное предпринимательство.</w:t>
-      </w:r>
-    </w:p>
-    <w:p>
-      <w:pPr>
-        <w:rPr>
+      <w:r>
+        <w:rPr>
+          <w:color w:val="3D3735"/>
+        </w:rPr>
+        <w:t>Информацию о партнёрстве и публикации курсов можно найти на официальном сайте или через контакты, указанные на портале UNESCO IITE.</w:t>
+      </w:r>
+    </w:p>
+    <w:p>
+      <w:pPr>
+        <w:spacing w:line="360" w:lineRule="auto"/>
+        <w:ind w:firstLine="709"/>
+        <w:jc w:val="both"/>
+        <w:rPr>
+          <w:color w:val="3D3735"/>
+        </w:rPr>
+      </w:pPr>
+      <w:r>
+        <w:rPr>
+          <w:color w:val="3D3735"/>
+        </w:rPr>
+        <w:lastRenderedPageBreak/>
+        <w:t>Платформа рекомендуется для авторов курсов на английском или других иностранных языках, ориентированных на международную аудиторию в Китае и за его пределами.</w:t>
+      </w:r>
+    </w:p>
+    <w:p>
+      <w:pPr>
+        <w:spacing w:line="360" w:lineRule="auto"/>
+        <w:ind w:firstLine="709"/>
+        <w:jc w:val="both"/>
+        <w:rPr>
+          <w:color w:val="3D3735"/>
           <w:lang w:val="en-US"/>
         </w:rPr>
       </w:pPr>
@@ -2337,115 +2843,30 @@
         <w:spacing w:line="360" w:lineRule="auto"/>
         <w:ind w:firstLine="709"/>
         <w:jc w:val="both"/>
-      </w:pPr>
-      <w:r>
-        <w:rPr>
-          <w:b/>
-          <w:bCs/>
-          <w:color w:val="3D3735"/>
-        </w:rPr>
-        <w:t>Основной язык платформы</w:t>
-      </w:r>
-      <w:r>
-        <w:rPr>
-          <w:color w:val="3D3735"/>
-        </w:rPr>
-        <w:t xml:space="preserve"> — английский, что делает её доступной для глобальной аудитории. В перспективе планируется внедрение версий на других языках.</w:t>
-      </w:r>
-    </w:p>
-    <w:p>
-      <w:pPr>
+        <w:rPr>
+          <w:color w:val="3D3735"/>
+        </w:rPr>
+      </w:pPr>
+      <w:r>
+        <w:rPr>
+          <w:color w:val="3D3735"/>
+        </w:rPr>
+        <w:t>Особенно актуальна для преподавателей дисциплин, связанных с китайской культурой, экономикой Китая, а также для специалистов, чей опыт может быть полезен китайской диаспоре за рубежом.</w:t>
+      </w:r>
+    </w:p>
+    <w:p>
+      <w:pPr>
+        <w:jc w:val="both"/>
         <w:rPr>
           <w:lang w:val="en-US"/>
         </w:rPr>
       </w:pPr>
-    </w:p>
-    <w:p>
-      <w:pPr>
-        <w:spacing w:line="360" w:lineRule="auto"/>
-        <w:ind w:firstLine="709"/>
-        <w:jc w:val="both"/>
-        <w:rPr>
-          <w:b/>
-          <w:bCs/>
-          <w:color w:val="3D3735"/>
-        </w:rPr>
-      </w:pPr>
-      <w:r>
-        <w:rPr>
-          <w:color w:val="3D3735"/>
-        </w:rPr>
-        <w:t xml:space="preserve">Формат обучения предусматривает доступ через персональные компьютеры и мобильные приложения, обеспечивая гибкость для пользователей в различных часовых поясах. </w:t>
-      </w:r>
-      <w:r>
-        <w:rPr>
-          <w:b/>
-          <w:bCs/>
-          <w:color w:val="3D3735"/>
-        </w:rPr>
-        <w:t>Платформа ориентирована на международное сотрудничество, что открывает возможности для зарубежных авторов и образовательных учреждений.</w:t>
-      </w:r>
-    </w:p>
-    <w:p>
-      <w:pPr>
+      <w:r>
         <w:rPr>
           <w:lang w:val="en-US"/>
         </w:rPr>
-      </w:pPr>
-    </w:p>
-    <w:p>
-      <w:pPr>
-        <w:spacing w:line="360" w:lineRule="auto"/>
-        <w:ind w:firstLine="709"/>
-        <w:jc w:val="both"/>
-        <w:rPr>
-          <w:color w:val="3D3735"/>
-        </w:rPr>
-      </w:pPr>
-      <w:r>
-        <w:rPr>
-          <w:color w:val="3D3735"/>
-        </w:rPr>
-        <w:t>Информацию о партнёрстве и публикации курсов можно найти на официальном сайте или через контакты, указанные на портале UNESCO IITE.</w:t>
-      </w:r>
-    </w:p>
-    <w:p>
-      <w:pPr>
-        <w:rPr>
-          <w:lang w:val="en-US"/>
-        </w:rPr>
-      </w:pPr>
-    </w:p>
-    <w:p>
-      <w:pPr>
-        <w:spacing w:line="360" w:lineRule="auto"/>
-        <w:ind w:firstLine="709"/>
-        <w:jc w:val="both"/>
-        <w:rPr>
-          <w:color w:val="3D3735"/>
-          <w:lang w:val="en-US"/>
-        </w:rPr>
-      </w:pPr>
-      <w:r>
-        <w:rPr>
-          <w:color w:val="3D3735"/>
-        </w:rPr>
-        <w:t xml:space="preserve">Платформа рекомендуется для авторов курсов на английском или других иностранных языках, ориентированных на международную аудиторию в Китае и за его пределами. Особенно актуальна для преподавателей дисциплин, связанных с китайской </w:t>
-      </w:r>
-      <w:r>
-        <w:rPr>
-          <w:color w:val="3D3735"/>
-        </w:rPr>
-        <w:lastRenderedPageBreak/>
-        <w:t>культурой, экономикой Китая, а также для специалистов, чей опыт может быть полезен китайской диаспоре за рубежом.</w:t>
-      </w:r>
-    </w:p>
-    <w:p>
-      <w:pPr>
-        <w:rPr>
-          <w:lang w:val="en-US"/>
-        </w:rPr>
-      </w:pPr>
+        <w:tab/>
+      </w:r>
     </w:p>
     <w:p>
       <w:pPr>
@@ -2531,195 +2952,194 @@
     </w:p>
     <w:p>
       <w:pPr>
-        <w:rPr>
+        <w:spacing w:line="360" w:lineRule="auto"/>
+        <w:ind w:firstLine="709"/>
+        <w:jc w:val="both"/>
+      </w:pPr>
+    </w:p>
+    <w:p>
+      <w:pPr>
+        <w:spacing w:line="360" w:lineRule="auto"/>
+        <w:ind w:firstLine="709"/>
+        <w:jc w:val="both"/>
+        <w:rPr>
+          <w:color w:val="3D3735"/>
+        </w:rPr>
+      </w:pPr>
+      <w:r>
+        <w:rPr>
+          <w:color w:val="3D3735"/>
+        </w:rPr>
+        <w:t xml:space="preserve">Бизнес-модель </w:t>
+      </w:r>
+      <w:proofErr w:type="spellStart"/>
+      <w:r>
+        <w:rPr>
+          <w:color w:val="3D3735"/>
+        </w:rPr>
+        <w:t>Yuanfudao</w:t>
+      </w:r>
+      <w:proofErr w:type="spellEnd"/>
+      <w:r>
+        <w:rPr>
+          <w:color w:val="3D3735"/>
+        </w:rPr>
+        <w:t xml:space="preserve"> основана на вертикально интегрированном подходе, сочетающем продажу AI-ориентированного оборудования (образовательные планшеты) с подпиской на образовательный контент.</w:t>
+      </w:r>
+    </w:p>
+    <w:p>
+      <w:pPr>
+        <w:spacing w:line="360" w:lineRule="auto"/>
+        <w:ind w:firstLine="709"/>
+        <w:jc w:val="both"/>
+      </w:pPr>
+    </w:p>
+    <w:p>
+      <w:pPr>
+        <w:spacing w:line="360" w:lineRule="auto"/>
+        <w:ind w:firstLine="709"/>
+        <w:jc w:val="both"/>
+      </w:pPr>
+      <w:r>
+        <w:rPr>
+          <w:color w:val="3D3735"/>
+        </w:rPr>
+        <w:t xml:space="preserve">Компания разработала собственную большую языковую модель </w:t>
+      </w:r>
+      <w:proofErr w:type="spellStart"/>
+      <w:r>
+        <w:rPr>
+          <w:color w:val="3D3735"/>
+        </w:rPr>
+        <w:t>Yuanli</w:t>
+      </w:r>
+      <w:proofErr w:type="spellEnd"/>
+      <w:r>
+        <w:rPr>
+          <w:color w:val="3D3735"/>
+        </w:rPr>
+        <w:t>, обученную на 500 миллионах часов учебных видео и 20 миллиардах студенческих вопросов. Эта технологическая база обеспечивает персонализацию обучения и высокую эффективность образовательного процесса.</w:t>
+      </w:r>
+    </w:p>
+    <w:p>
+      <w:pPr>
+        <w:spacing w:line="360" w:lineRule="auto"/>
+        <w:ind w:firstLine="709"/>
+        <w:jc w:val="both"/>
+      </w:pPr>
+    </w:p>
+    <w:p>
+      <w:pPr>
+        <w:spacing w:line="360" w:lineRule="auto"/>
+        <w:ind w:firstLine="709"/>
+        <w:jc w:val="both"/>
+        <w:rPr>
+          <w:color w:val="3D3735"/>
+        </w:rPr>
+      </w:pPr>
+      <w:r>
+        <w:rPr>
+          <w:color w:val="3D3735"/>
+        </w:rPr>
+        <w:t xml:space="preserve">Аудитория </w:t>
+      </w:r>
+      <w:proofErr w:type="spellStart"/>
+      <w:r>
+        <w:rPr>
+          <w:color w:val="3D3735"/>
+        </w:rPr>
+        <w:t>Yuanfudao</w:t>
+      </w:r>
+      <w:proofErr w:type="spellEnd"/>
+      <w:r>
+        <w:rPr>
+          <w:color w:val="3D3735"/>
+        </w:rPr>
+        <w:t xml:space="preserve"> превышает 400 миллионов пользователей по всем направлениям, что делает её одной из самых масштабных образовательных платформ в мире.</w:t>
+      </w:r>
+    </w:p>
+    <w:p>
+      <w:pPr>
+        <w:spacing w:line="360" w:lineRule="auto"/>
+        <w:ind w:firstLine="709"/>
+        <w:jc w:val="both"/>
+      </w:pPr>
+    </w:p>
+    <w:p>
+      <w:pPr>
+        <w:spacing w:line="360" w:lineRule="auto"/>
+        <w:ind w:firstLine="709"/>
+        <w:jc w:val="both"/>
+        <w:rPr>
+          <w:color w:val="3D3735"/>
           <w:lang w:val="en-US"/>
         </w:rPr>
       </w:pPr>
-    </w:p>
-    <w:p>
-      <w:pPr>
-        <w:spacing w:line="360" w:lineRule="auto"/>
-        <w:ind w:firstLine="709"/>
-        <w:jc w:val="both"/>
-        <w:rPr>
-          <w:color w:val="3D3735"/>
-        </w:rPr>
-      </w:pPr>
-      <w:r>
-        <w:rPr>
-          <w:color w:val="3D3735"/>
-        </w:rPr>
-        <w:t xml:space="preserve">Бизнес-модель </w:t>
+      <w:r>
+        <w:rPr>
+          <w:color w:val="3D3735"/>
+        </w:rPr>
+        <w:t xml:space="preserve">Ключевые продукты включают приложение для сканирования и решения задач </w:t>
       </w:r>
       <w:proofErr w:type="spellStart"/>
       <w:r>
         <w:rPr>
           <w:color w:val="3D3735"/>
         </w:rPr>
-        <w:t>Yuanfudao</w:t>
+        <w:t>Xiaoyuan</w:t>
       </w:r>
       <w:proofErr w:type="spellEnd"/>
       <w:r>
         <w:rPr>
           <w:color w:val="3D3735"/>
         </w:rPr>
-        <w:t xml:space="preserve"> основана на вертикально интегрированном подходе, сочетающем продажу AI-ориентированного оборудования (образовательные планшеты) с подпиской на образовательный контент.</w:t>
-      </w:r>
-    </w:p>
-    <w:p>
-      <w:pPr>
-        <w:rPr>
-          <w:lang w:val="en-US"/>
-        </w:rPr>
-      </w:pPr>
-    </w:p>
-    <w:p>
-      <w:pPr>
-        <w:spacing w:line="360" w:lineRule="auto"/>
-        <w:ind w:firstLine="709"/>
-        <w:jc w:val="both"/>
-      </w:pPr>
-      <w:r>
-        <w:rPr>
-          <w:color w:val="3D3735"/>
-        </w:rPr>
-        <w:t xml:space="preserve">Компания разработала собственную большую языковую модель </w:t>
+        <w:t xml:space="preserve"> </w:t>
       </w:r>
       <w:proofErr w:type="spellStart"/>
       <w:r>
         <w:rPr>
           <w:color w:val="3D3735"/>
         </w:rPr>
-        <w:t>Yuanli</w:t>
+        <w:t>Souti</w:t>
       </w:r>
       <w:proofErr w:type="spellEnd"/>
       <w:r>
         <w:rPr>
           <w:color w:val="3D3735"/>
         </w:rPr>
-        <w:t>, обученную на 500 миллионах часов учебных видео и 20 миллиардах студенческих вопросов. Эта технологическая база обеспечивает персонализацию обучения и высокую эффективность образовательного процесса.</w:t>
-      </w:r>
-    </w:p>
-    <w:p>
-      <w:pPr>
-        <w:rPr>
-          <w:lang w:val="en-US"/>
-        </w:rPr>
-      </w:pPr>
-    </w:p>
-    <w:p>
-      <w:pPr>
-        <w:spacing w:line="360" w:lineRule="auto"/>
-        <w:ind w:firstLine="709"/>
-        <w:jc w:val="both"/>
-        <w:rPr>
-          <w:color w:val="3D3735"/>
-        </w:rPr>
-      </w:pPr>
-      <w:r>
-        <w:rPr>
-          <w:color w:val="3D3735"/>
-        </w:rPr>
-        <w:t xml:space="preserve">Аудитория </w:t>
+        <w:t xml:space="preserve">, AI-обучающий планшет, а также курсы для дошкольников и взрослых. После </w:t>
       </w:r>
       <w:proofErr w:type="spellStart"/>
       <w:r>
         <w:rPr>
           <w:color w:val="3D3735"/>
         </w:rPr>
-        <w:t>Yuanfudao</w:t>
+        <w:t>regulatory</w:t>
       </w:r>
       <w:proofErr w:type="spellEnd"/>
       <w:r>
         <w:rPr>
           <w:color w:val="3D3735"/>
         </w:rPr>
-        <w:t xml:space="preserve"> превышает 400 миллионов пользователей по всем направлениям, что делает её одной из самых масштабных образовательных платформ в мире.</w:t>
-      </w:r>
-    </w:p>
-    <w:p/>
-    <w:p>
-      <w:pPr>
-        <w:spacing w:line="360" w:lineRule="auto"/>
-        <w:ind w:firstLine="709"/>
-        <w:jc w:val="both"/>
-        <w:rPr>
-          <w:color w:val="3D3735"/>
-          <w:lang w:val="en-US"/>
-        </w:rPr>
-      </w:pPr>
-      <w:r>
-        <w:rPr>
-          <w:color w:val="3D3735"/>
-        </w:rPr>
-        <w:t xml:space="preserve">Ключевые продукты включают приложение для сканирования и решения задач </w:t>
+        <w:t xml:space="preserve"> </w:t>
       </w:r>
       <w:proofErr w:type="spellStart"/>
       <w:r>
         <w:rPr>
           <w:color w:val="3D3735"/>
         </w:rPr>
-        <w:t>Xiaoyuan</w:t>
+        <w:t>shifts</w:t>
       </w:r>
       <w:proofErr w:type="spellEnd"/>
       <w:r>
         <w:rPr>
           <w:color w:val="3D3735"/>
         </w:rPr>
-        <w:t xml:space="preserve"> </w:t>
-      </w:r>
-      <w:proofErr w:type="spellStart"/>
-      <w:r>
-        <w:rPr>
-          <w:color w:val="3D3735"/>
-        </w:rPr>
-        <w:t>Souti</w:t>
-      </w:r>
-      <w:proofErr w:type="spellEnd"/>
-      <w:r>
-        <w:rPr>
-          <w:color w:val="3D3735"/>
-        </w:rPr>
-        <w:t xml:space="preserve">, AI-обучающий планшет, а также курсы для дошкольников и взрослых. После </w:t>
-      </w:r>
-      <w:proofErr w:type="spellStart"/>
-      <w:r>
-        <w:rPr>
-          <w:color w:val="3D3735"/>
-        </w:rPr>
-        <w:t>regulatory</w:t>
-      </w:r>
-      <w:proofErr w:type="spellEnd"/>
-      <w:r>
-        <w:rPr>
-          <w:color w:val="3D3735"/>
-        </w:rPr>
-        <w:t xml:space="preserve"> </w:t>
-      </w:r>
-      <w:proofErr w:type="spellStart"/>
-      <w:r>
-        <w:rPr>
-          <w:color w:val="3D3735"/>
-        </w:rPr>
-        <w:t>shifts</w:t>
-      </w:r>
-      <w:proofErr w:type="spellEnd"/>
-      <w:r>
-        <w:rPr>
-          <w:color w:val="3D3735"/>
-        </w:rPr>
         <w:t xml:space="preserve"> компания значительно расширила направление профессионального обучения и развития навыков.</w:t>
       </w:r>
     </w:p>
     <w:p>
       <w:pPr>
-        <w:rPr>
-          <w:lang w:val="en-US"/>
-        </w:rPr>
-      </w:pPr>
-    </w:p>
-    <w:p>
-      <w:pPr>
         <w:spacing w:line="360" w:lineRule="auto"/>
         <w:ind w:firstLine="709"/>
         <w:jc w:val="both"/>
@@ -2730,6 +3150,7 @@
           <w:bCs/>
           <w:color w:val="26211F"/>
         </w:rPr>
+        <w:lastRenderedPageBreak/>
         <w:t>Процесс публикации:</w:t>
       </w:r>
     </w:p>
@@ -2798,7 +3219,6 @@
         <w:rPr>
           <w:color w:val="3D3735"/>
         </w:rPr>
-        <w:lastRenderedPageBreak/>
         <w:t>Особое внимание уделяется курсам, интегрируемым в экосистему (приложения, планшеты)</w:t>
       </w:r>
     </w:p>
@@ -2824,9 +3244,6 @@
       <w:pPr>
         <w:spacing w:line="360" w:lineRule="auto"/>
         <w:jc w:val="both"/>
-        <w:rPr>
-          <w:lang w:val="en-US"/>
-        </w:rPr>
       </w:pPr>
     </w:p>
     <w:p>
@@ -2838,41 +3255,160 @@
       </w:pPr>
       <w:bookmarkStart w:id="7" w:name="_Toc224571158"/>
       <w:r>
-        <w:t xml:space="preserve">2.4. </w:t>
+        <w:t>2.4. Q</w:t>
       </w:r>
       <w:proofErr w:type="spellStart"/>
       <w:r>
+        <w:t>uantaSing</w:t>
+      </w:r>
+      <w:proofErr w:type="spellEnd"/>
+      <w:r>
+        <w:t xml:space="preserve"> Group (</w:t>
+      </w:r>
+      <w:proofErr w:type="spellStart"/>
+      <w:r>
+        <w:t>Quantasing</w:t>
+      </w:r>
+      <w:proofErr w:type="spellEnd"/>
+      <w:r>
+        <w:t>)</w:t>
+      </w:r>
+      <w:bookmarkEnd w:id="7"/>
+    </w:p>
+    <w:p>
+      <w:pPr>
+        <w:spacing w:line="360" w:lineRule="auto"/>
+        <w:ind w:firstLine="709"/>
+        <w:jc w:val="both"/>
+        <w:rPr>
+          <w:color w:val="3D3735"/>
+        </w:rPr>
+      </w:pPr>
+      <w:proofErr w:type="spellStart"/>
+      <w:r>
+        <w:rPr>
+          <w:b/>
+          <w:bCs/>
+          <w:color w:val="3D3735"/>
+        </w:rPr>
         <w:t>QuantaSing</w:t>
       </w:r>
       <w:proofErr w:type="spellEnd"/>
       <w:r>
-        <w:t xml:space="preserve"> Group (</w:t>
-      </w:r>
+        <w:rPr>
+          <w:b/>
+          <w:bCs/>
+          <w:color w:val="3D3735"/>
+        </w:rPr>
+        <w:t xml:space="preserve"> Group</w:t>
+      </w:r>
+      <w:r>
+        <w:rPr>
+          <w:color w:val="3D3735"/>
+        </w:rPr>
+        <w:t xml:space="preserve"> — ведущая китайская компания, специализирующаяся на онлайн-обучении для взрослых. Компания листингована на NASDAQ, что подтверждает её финансовую устойчивость и прозрачность бизнес-модели.</w:t>
+      </w:r>
+    </w:p>
+    <w:p>
+      <w:pPr>
+        <w:spacing w:line="360" w:lineRule="auto"/>
+        <w:ind w:firstLine="709"/>
+        <w:jc w:val="both"/>
+      </w:pPr>
+    </w:p>
+    <w:p>
+      <w:pPr>
+        <w:spacing w:line="360" w:lineRule="auto"/>
+        <w:ind w:firstLine="709"/>
+        <w:jc w:val="both"/>
+      </w:pPr>
       <w:proofErr w:type="spellStart"/>
       <w:r>
-        <w:t>Quantasing</w:t>
+        <w:rPr>
+          <w:color w:val="3D3735"/>
+        </w:rPr>
+        <w:t>QuantaSing</w:t>
       </w:r>
       <w:proofErr w:type="spellEnd"/>
       <w:r>
-        <w:t>)</w:t>
-      </w:r>
-      <w:bookmarkEnd w:id="7"/>
-    </w:p>
-    <w:p>
-      <w:pPr>
-        <w:spacing w:line="360" w:lineRule="auto"/>
-        <w:ind w:firstLine="709"/>
-        <w:jc w:val="both"/>
-        <w:rPr>
-          <w:color w:val="3D3735"/>
-          <w:lang w:val="en-US"/>
-        </w:rPr>
-      </w:pPr>
+        <w:rPr>
+          <w:color w:val="3D3735"/>
+        </w:rPr>
+        <w:t xml:space="preserve"> позиционируется как комплексная и инновационная платформа для непрерывного образования взрослых, использующая передовые технологические решения.</w:t>
+      </w:r>
+    </w:p>
+    <w:p>
+      <w:pPr>
+        <w:spacing w:line="360" w:lineRule="auto"/>
+        <w:ind w:firstLine="709"/>
+        <w:jc w:val="both"/>
+      </w:pPr>
+    </w:p>
+    <w:p>
+      <w:pPr>
+        <w:spacing w:line="360" w:lineRule="auto"/>
+        <w:ind w:firstLine="709"/>
+        <w:jc w:val="both"/>
+      </w:pPr>
+      <w:r>
+        <w:rPr>
+          <w:b/>
+          <w:bCs/>
+          <w:color w:val="3D3735"/>
+        </w:rPr>
+        <w:t>Ключевая особенность платформы</w:t>
+      </w:r>
+      <w:r>
+        <w:rPr>
+          <w:color w:val="3D3735"/>
+        </w:rPr>
+        <w:t xml:space="preserve"> — проведение курсов через прямые эфиры (</w:t>
+      </w:r>
       <w:proofErr w:type="spellStart"/>
       <w:r>
         <w:rPr>
-          <w:b/>
-          <w:bCs/>
+          <w:color w:val="3D3735"/>
+        </w:rPr>
+        <w:t>livestreaming</w:t>
+      </w:r>
+      <w:proofErr w:type="spellEnd"/>
+      <w:r>
+        <w:rPr>
+          <w:color w:val="3D3735"/>
+        </w:rPr>
+        <w:t>) с использованием сообществ и модели OMO (Online-</w:t>
+      </w:r>
+      <w:proofErr w:type="spellStart"/>
+      <w:r>
+        <w:rPr>
+          <w:color w:val="3D3735"/>
+        </w:rPr>
+        <w:t>Merge</w:t>
+      </w:r>
+      <w:proofErr w:type="spellEnd"/>
+      <w:r>
+        <w:rPr>
+          <w:color w:val="3D3735"/>
+        </w:rPr>
+        <w:t>-</w:t>
+      </w:r>
+      <w:proofErr w:type="spellStart"/>
+      <w:r>
+        <w:rPr>
+          <w:color w:val="3D3735"/>
+        </w:rPr>
+        <w:t>Offline</w:t>
+      </w:r>
+      <w:proofErr w:type="spellEnd"/>
+      <w:r>
+        <w:rPr>
+          <w:color w:val="3D3735"/>
+        </w:rPr>
+        <w:t xml:space="preserve">). Эта модель обеспечивает максимальную вовлечённость учащихся и создаёт дополнительные возможности для интерактивного обучения. </w:t>
+      </w:r>
+      <w:proofErr w:type="spellStart"/>
+      <w:r>
+        <w:rPr>
           <w:color w:val="3D3735"/>
         </w:rPr>
         <w:t>QuantaSing</w:t>
@@ -2880,32 +3416,44 @@
       <w:proofErr w:type="spellEnd"/>
       <w:r>
         <w:rPr>
-          <w:b/>
-          <w:bCs/>
-          <w:color w:val="3D3735"/>
-        </w:rPr>
-        <w:t xml:space="preserve"> Group</w:t>
-      </w:r>
-      <w:r>
-        <w:rPr>
-          <w:color w:val="3D3735"/>
-        </w:rPr>
-        <w:t xml:space="preserve"> — ведущая китайская компания, специализирующаяся на онлайн-обучении для взрослых. Компания листингована на NASDAQ, что подтверждает её финансовую устойчивость и прозрачность бизнес-модели.</w:t>
-      </w:r>
-    </w:p>
-    <w:p>
-      <w:pPr>
-        <w:rPr>
-          <w:lang w:val="en-US"/>
-        </w:rPr>
-      </w:pPr>
-    </w:p>
-    <w:p>
-      <w:pPr>
-        <w:spacing w:line="360" w:lineRule="auto"/>
-        <w:ind w:firstLine="709"/>
-        <w:jc w:val="both"/>
-      </w:pPr>
+          <w:color w:val="3D3735"/>
+        </w:rPr>
+        <w:t xml:space="preserve"> активно интегрирует AI для создания персонализированных учебных планов, используя систему «двойного учителя», где живой преподаватель работает в связке с AI-коучем.</w:t>
+      </w:r>
+    </w:p>
+    <w:p>
+      <w:pPr>
+        <w:spacing w:line="360" w:lineRule="auto"/>
+        <w:ind w:firstLine="709"/>
+        <w:jc w:val="both"/>
+      </w:pPr>
+    </w:p>
+    <w:p>
+      <w:pPr>
+        <w:spacing w:line="360" w:lineRule="auto"/>
+        <w:ind w:firstLine="709"/>
+        <w:jc w:val="both"/>
+      </w:pPr>
+      <w:r>
+        <w:rPr>
+          <w:color w:val="3D3735"/>
+        </w:rPr>
+        <w:t xml:space="preserve">Направления обучения охватывают личное развитие, финансовую грамотность, искусство и творчество, а также профессиональные навыки. </w:t>
+      </w:r>
+      <w:r>
+        <w:rPr>
+          <w:b/>
+          <w:bCs/>
+          <w:color w:val="3D3735"/>
+        </w:rPr>
+        <w:t xml:space="preserve">Компания активно ищет партнёров и экспертов для создания контента, предлагая различные форматы сотрудничества: </w:t>
+      </w:r>
+      <w:r>
+        <w:rPr>
+          <w:color w:val="3D3735"/>
+        </w:rPr>
+        <w:t xml:space="preserve">от создания полноценного курса до проведения серии лекций в прямом эфире. Связаться с </w:t>
+      </w:r>
       <w:proofErr w:type="spellStart"/>
       <w:r>
         <w:rPr>
@@ -2918,156 +3466,30 @@
         <w:rPr>
           <w:color w:val="3D3735"/>
         </w:rPr>
-        <w:t xml:space="preserve"> позиционируется как комплексная и инновационная платформа для непрерывного образования взрослых, использующая передовые технологические решения.</w:t>
-      </w:r>
-    </w:p>
-    <w:p/>
-    <w:p>
-      <w:pPr>
-        <w:spacing w:line="360" w:lineRule="auto"/>
-        <w:ind w:firstLine="709"/>
-        <w:jc w:val="both"/>
-      </w:pPr>
-      <w:r>
-        <w:rPr>
-          <w:b/>
-          <w:bCs/>
-          <w:color w:val="3D3735"/>
-        </w:rPr>
-        <w:t>Ключевая особенность платформы</w:t>
-      </w:r>
-      <w:r>
-        <w:rPr>
-          <w:color w:val="3D3735"/>
-        </w:rPr>
-        <w:t xml:space="preserve"> — проведение курсов через прямые эфиры (</w:t>
-      </w:r>
-      <w:proofErr w:type="spellStart"/>
-      <w:r>
-        <w:rPr>
-          <w:color w:val="3D3735"/>
-        </w:rPr>
-        <w:t>livestreaming</w:t>
-      </w:r>
-      <w:proofErr w:type="spellEnd"/>
-      <w:r>
-        <w:rPr>
-          <w:color w:val="3D3735"/>
-        </w:rPr>
-        <w:t>) с использованием сообществ и модели OMO (Online-</w:t>
-      </w:r>
-      <w:proofErr w:type="spellStart"/>
-      <w:r>
-        <w:rPr>
-          <w:color w:val="3D3735"/>
-        </w:rPr>
-        <w:t>Merge</w:t>
-      </w:r>
-      <w:proofErr w:type="spellEnd"/>
-      <w:r>
-        <w:rPr>
-          <w:color w:val="3D3735"/>
-        </w:rPr>
-        <w:t>-</w:t>
-      </w:r>
-      <w:proofErr w:type="spellStart"/>
-      <w:r>
-        <w:rPr>
-          <w:color w:val="3D3735"/>
-        </w:rPr>
-        <w:t>Offline</w:t>
-      </w:r>
-      <w:proofErr w:type="spellEnd"/>
-      <w:r>
-        <w:rPr>
-          <w:color w:val="3D3735"/>
-        </w:rPr>
-        <w:t xml:space="preserve">). Эта модель обеспечивает максимальную вовлечённость учащихся и создаёт дополнительные возможности для интерактивного обучения. </w:t>
-      </w:r>
-      <w:proofErr w:type="spellStart"/>
-      <w:r>
-        <w:rPr>
-          <w:color w:val="3D3735"/>
-        </w:rPr>
-        <w:t>QuantaSing</w:t>
-      </w:r>
-      <w:proofErr w:type="spellEnd"/>
-      <w:r>
-        <w:rPr>
-          <w:color w:val="3D3735"/>
-        </w:rPr>
-        <w:t xml:space="preserve"> активно интегрирует AI для создания персонализированных учебных планов, используя систему «двойного учителя», где живой преподаватель работает в связке с AI-коучем.</w:t>
-      </w:r>
-    </w:p>
-    <w:p>
-      <w:pPr>
-        <w:rPr>
-          <w:lang w:val="en-US"/>
-        </w:rPr>
-      </w:pPr>
-    </w:p>
-    <w:p>
-      <w:pPr>
-        <w:spacing w:line="360" w:lineRule="auto"/>
-        <w:ind w:firstLine="709"/>
-        <w:jc w:val="both"/>
-      </w:pPr>
-      <w:r>
-        <w:rPr>
-          <w:color w:val="3D3735"/>
-        </w:rPr>
-        <w:t xml:space="preserve">Направления обучения охватывают личное развитие, финансовую грамотность, искусство и творчество, а также профессиональные навыки. </w:t>
-      </w:r>
-      <w:r>
-        <w:rPr>
-          <w:b/>
-          <w:bCs/>
-          <w:color w:val="3D3735"/>
-        </w:rPr>
-        <w:t xml:space="preserve">Компания активно ищет партнёров и экспертов для создания контента, предлагая различные форматы сотрудничества: </w:t>
-      </w:r>
-      <w:r>
-        <w:rPr>
-          <w:color w:val="3D3735"/>
-        </w:rPr>
-        <w:t xml:space="preserve">от создания полноценного курса до проведения серии лекций в прямом эфире. Связаться с </w:t>
-      </w:r>
-      <w:proofErr w:type="spellStart"/>
-      <w:r>
-        <w:rPr>
-          <w:color w:val="3D3735"/>
-        </w:rPr>
-        <w:t>QuantaSing</w:t>
-      </w:r>
-      <w:proofErr w:type="spellEnd"/>
-      <w:r>
-        <w:rPr>
-          <w:color w:val="3D3735"/>
-        </w:rPr>
         <w:t xml:space="preserve"> можно через официальный сайт или отдел по работе с инвесторами.</w:t>
       </w:r>
     </w:p>
     <w:p>
       <w:pPr>
-        <w:rPr>
-          <w:lang w:val="en-US"/>
-        </w:rPr>
-      </w:pPr>
-    </w:p>
-    <w:p>
-      <w:pPr>
-        <w:spacing w:line="360" w:lineRule="auto"/>
-        <w:ind w:firstLine="709"/>
-        <w:jc w:val="both"/>
-        <w:rPr>
-          <w:color w:val="3D3735"/>
-          <w:lang w:val="en-US"/>
-        </w:rPr>
-      </w:pPr>
-      <w:r>
-        <w:rPr>
-          <w:color w:val="3D3735"/>
-        </w:rPr>
+        <w:spacing w:line="360" w:lineRule="auto"/>
+        <w:ind w:firstLine="709"/>
+        <w:jc w:val="both"/>
+      </w:pPr>
+    </w:p>
+    <w:p>
+      <w:pPr>
+        <w:spacing w:line="360" w:lineRule="auto"/>
+        <w:ind w:firstLine="709"/>
+        <w:jc w:val="both"/>
+        <w:rPr>
+          <w:color w:val="3D3735"/>
+        </w:rPr>
+      </w:pPr>
+      <w:r>
+        <w:rPr>
+          <w:color w:val="3D3735"/>
+        </w:rPr>
+        <w:lastRenderedPageBreak/>
         <w:t xml:space="preserve">Платформа рекомендуется для экспертов в области личного развития, финансов, творчества и других дисциплин, желающих масштабировать свои знания через технологичную платформу с готовой аудиторией. </w:t>
       </w:r>
       <w:r>
@@ -3081,9 +3503,7 @@
     </w:p>
     <w:p>
       <w:pPr>
-        <w:rPr>
-          <w:lang w:val="en-US"/>
-        </w:rPr>
+        <w:jc w:val="both"/>
       </w:pPr>
     </w:p>
     <w:p>
@@ -3095,353 +3515,356 @@
       </w:pPr>
       <w:bookmarkStart w:id="8" w:name="_Toc224571159"/>
       <w:r>
+        <w:t>2.5. Национальная платформа интеллектуального образования</w:t>
+      </w:r>
+      <w:bookmarkEnd w:id="8"/>
+    </w:p>
+    <w:p>
+      <w:pPr>
+        <w:spacing w:line="360" w:lineRule="auto"/>
+        <w:ind w:firstLine="709"/>
+        <w:jc w:val="both"/>
+        <w:rPr>
+          <w:color w:val="3D3735"/>
+        </w:rPr>
+      </w:pPr>
+      <w:r>
+        <w:rPr>
+          <w:b/>
+          <w:bCs/>
+          <w:color w:val="3D3735"/>
+        </w:rPr>
+        <w:t xml:space="preserve">Национальная платформа интеллектуального образования Китая (National Smart Education Platform </w:t>
+      </w:r>
+      <w:proofErr w:type="spellStart"/>
+      <w:r>
+        <w:rPr>
+          <w:b/>
+          <w:bCs/>
+          <w:color w:val="3D3735"/>
+        </w:rPr>
+        <w:t>of</w:t>
+      </w:r>
+      <w:proofErr w:type="spellEnd"/>
+      <w:r>
+        <w:rPr>
+          <w:b/>
+          <w:bCs/>
+          <w:color w:val="3D3735"/>
+        </w:rPr>
+        <w:t xml:space="preserve"> China)</w:t>
+      </w:r>
+      <w:r>
+        <w:rPr>
+          <w:color w:val="3D3735"/>
+        </w:rPr>
+        <w:t xml:space="preserve"> — комплексная государственная платформа, предоставляющая публичные образовательные услуги.</w:t>
+      </w:r>
+    </w:p>
+    <w:p>
+      <w:pPr>
+        <w:spacing w:line="360" w:lineRule="auto"/>
+        <w:ind w:firstLine="709"/>
+        <w:jc w:val="both"/>
+      </w:pPr>
+    </w:p>
+    <w:p>
+      <w:pPr>
+        <w:spacing w:line="360" w:lineRule="auto"/>
+        <w:ind w:firstLine="709"/>
+        <w:jc w:val="both"/>
+        <w:rPr>
+          <w:color w:val="3D3735"/>
+        </w:rPr>
+      </w:pPr>
+      <w:r>
+        <w:rPr>
+          <w:color w:val="3D3735"/>
+        </w:rPr>
+        <w:t xml:space="preserve">Платформа стала лауреатом премии </w:t>
+      </w:r>
+      <w:r>
+        <w:rPr>
+          <w:b/>
+          <w:bCs/>
+          <w:color w:val="3D3735"/>
+        </w:rPr>
+        <w:t>ЮНЕСКО</w:t>
+      </w:r>
+      <w:r>
+        <w:rPr>
+          <w:color w:val="3D3735"/>
+        </w:rPr>
+        <w:t xml:space="preserve"> за использование </w:t>
+      </w:r>
+      <w:r>
+        <w:rPr>
+          <w:b/>
+          <w:bCs/>
+          <w:color w:val="3D3735"/>
+        </w:rPr>
+        <w:t>ИКТ</w:t>
+      </w:r>
+      <w:r>
+        <w:rPr>
+          <w:color w:val="3D3735"/>
+        </w:rPr>
+        <w:t xml:space="preserve"> в образовании, что подтверждает её международное признание и соответствие высоким стандартам качества.</w:t>
+      </w:r>
+    </w:p>
+    <w:p>
+      <w:pPr>
+        <w:spacing w:line="360" w:lineRule="auto"/>
+        <w:ind w:firstLine="709"/>
+        <w:jc w:val="both"/>
+      </w:pPr>
+    </w:p>
+    <w:p>
+      <w:pPr>
+        <w:spacing w:line="360" w:lineRule="auto"/>
+        <w:ind w:firstLine="709"/>
+        <w:jc w:val="both"/>
+        <w:rPr>
+          <w:color w:val="3D3735"/>
+        </w:rPr>
+      </w:pPr>
+      <w:r>
+        <w:rPr>
+          <w:b/>
+          <w:bCs/>
+          <w:color w:val="3D3735"/>
+        </w:rPr>
+        <w:t>Создание платформы осуществлено при поддержке Министерства образования КНР.</w:t>
+      </w:r>
+    </w:p>
+    <w:p>
+      <w:pPr>
+        <w:spacing w:line="360" w:lineRule="auto"/>
+        <w:ind w:firstLine="709"/>
+        <w:jc w:val="both"/>
+      </w:pPr>
+    </w:p>
+    <w:p>
+      <w:pPr>
+        <w:spacing w:line="360" w:lineRule="auto"/>
+        <w:ind w:firstLine="709"/>
+        <w:jc w:val="both"/>
+        <w:rPr>
+          <w:color w:val="3D3735"/>
+        </w:rPr>
+      </w:pPr>
+      <w:r>
+        <w:rPr>
+          <w:b/>
+          <w:bCs/>
+          <w:color w:val="3D3735"/>
+        </w:rPr>
+        <w:t>Стратегическая цель платформы</w:t>
+      </w:r>
+      <w:r>
+        <w:rPr>
+          <w:color w:val="3D3735"/>
+        </w:rPr>
+        <w:t xml:space="preserve"> — сокращение разрыва в доступе к качественному образованию между городскими и сельскими районами страны.</w:t>
+      </w:r>
+    </w:p>
+    <w:p>
+      <w:pPr>
+        <w:spacing w:line="360" w:lineRule="auto"/>
+        <w:ind w:firstLine="709"/>
+        <w:jc w:val="both"/>
+        <w:rPr>
+          <w:color w:val="3D3735"/>
+        </w:rPr>
+      </w:pPr>
+    </w:p>
+    <w:p>
+      <w:pPr>
+        <w:spacing w:line="360" w:lineRule="auto"/>
+        <w:ind w:firstLine="709"/>
+        <w:jc w:val="both"/>
+      </w:pPr>
+      <w:r>
+        <w:rPr>
+          <w:color w:val="3D3735"/>
+        </w:rPr>
+        <w:t xml:space="preserve">Платформа предоставляет обширную библиотеку ресурсов, включая материалы для профессионального образования и развития навыков </w:t>
+      </w:r>
+      <w:r>
+        <w:rPr>
+          <w:b/>
+          <w:bCs/>
+          <w:color w:val="3D3735"/>
+        </w:rPr>
+        <w:t xml:space="preserve">(TVET — </w:t>
+      </w:r>
+      <w:proofErr w:type="spellStart"/>
+      <w:r>
+        <w:rPr>
+          <w:b/>
+          <w:bCs/>
+          <w:color w:val="3D3735"/>
+        </w:rPr>
+        <w:t>Technical</w:t>
+      </w:r>
+      <w:proofErr w:type="spellEnd"/>
+      <w:r>
+        <w:rPr>
+          <w:b/>
+          <w:bCs/>
+          <w:color w:val="3D3735"/>
+        </w:rPr>
+        <w:t xml:space="preserve"> </w:t>
+      </w:r>
+      <w:proofErr w:type="spellStart"/>
+      <w:r>
+        <w:rPr>
+          <w:b/>
+          <w:bCs/>
+          <w:color w:val="3D3735"/>
+        </w:rPr>
+        <w:t>and</w:t>
+      </w:r>
+      <w:proofErr w:type="spellEnd"/>
+      <w:r>
+        <w:rPr>
+          <w:b/>
+          <w:bCs/>
+          <w:color w:val="3D3735"/>
+        </w:rPr>
+        <w:t xml:space="preserve"> </w:t>
+      </w:r>
+      <w:proofErr w:type="spellStart"/>
+      <w:r>
+        <w:rPr>
+          <w:b/>
+          <w:bCs/>
+          <w:color w:val="3D3735"/>
+        </w:rPr>
+        <w:t>Vocational</w:t>
+      </w:r>
+      <w:proofErr w:type="spellEnd"/>
+      <w:r>
+        <w:rPr>
+          <w:b/>
+          <w:bCs/>
+          <w:color w:val="3D3735"/>
+        </w:rPr>
+        <w:t xml:space="preserve"> Education </w:t>
+      </w:r>
+      <w:proofErr w:type="spellStart"/>
+      <w:r>
+        <w:rPr>
+          <w:b/>
+          <w:bCs/>
+          <w:color w:val="3D3735"/>
+        </w:rPr>
+        <w:t>and</w:t>
+      </w:r>
+      <w:proofErr w:type="spellEnd"/>
+      <w:r>
+        <w:rPr>
+          <w:b/>
+          <w:bCs/>
+          <w:color w:val="3D3735"/>
+        </w:rPr>
+        <w:t xml:space="preserve"> </w:t>
+      </w:r>
+      <w:proofErr w:type="spellStart"/>
+      <w:r>
+        <w:rPr>
+          <w:b/>
+          <w:bCs/>
+          <w:color w:val="3D3735"/>
+        </w:rPr>
+        <w:t>Training</w:t>
+      </w:r>
+      <w:proofErr w:type="spellEnd"/>
+      <w:r>
+        <w:rPr>
+          <w:b/>
+          <w:bCs/>
+          <w:color w:val="3D3735"/>
+        </w:rPr>
+        <w:t>)</w:t>
+      </w:r>
+      <w:r>
+        <w:rPr>
+          <w:color w:val="3D3735"/>
+        </w:rPr>
+        <w:t>. Особое внимание уделяется поддержке учителей и повышению их цифровой грамотности.</w:t>
+      </w:r>
+    </w:p>
+    <w:p>
+      <w:pPr>
+        <w:spacing w:line="360" w:lineRule="auto"/>
+        <w:ind w:firstLine="709"/>
+        <w:jc w:val="both"/>
+        <w:rPr>
+          <w:color w:val="3D3735"/>
+        </w:rPr>
+      </w:pPr>
+    </w:p>
+    <w:p>
+      <w:pPr>
+        <w:spacing w:line="360" w:lineRule="auto"/>
+        <w:ind w:firstLine="709"/>
+        <w:jc w:val="both"/>
+        <w:rPr>
+          <w:color w:val="3D3735"/>
+        </w:rPr>
+      </w:pPr>
+      <w:r>
+        <w:rPr>
+          <w:b/>
+          <w:bCs/>
+          <w:color w:val="3D3735"/>
+        </w:rPr>
+        <w:t>Платформа функционирует в основном как агрегатор государственного и аккредитованного контента.</w:t>
+      </w:r>
+      <w:r>
+        <w:rPr>
+          <w:color w:val="3D3735"/>
+        </w:rPr>
+        <w:t xml:space="preserve"> Публикация материалов возможна через участие в государственных программах и конкурсах Министерства образования.</w:t>
+      </w:r>
+    </w:p>
+    <w:p>
+      <w:pPr>
+        <w:spacing w:line="360" w:lineRule="auto"/>
+        <w:ind w:firstLine="709"/>
+        <w:jc w:val="both"/>
+        <w:rPr>
+          <w:color w:val="3D3735"/>
+        </w:rPr>
+      </w:pPr>
+    </w:p>
+    <w:p>
+      <w:pPr>
+        <w:spacing w:line="360" w:lineRule="auto"/>
+        <w:ind w:firstLine="709"/>
+        <w:jc w:val="both"/>
+      </w:pPr>
+      <w:r>
+        <w:rPr>
+          <w:b/>
+          <w:bCs/>
+          <w:color w:val="3D3735"/>
+        </w:rPr>
+        <w:t>Требуется соответствие государственным образовательным стандартам и приоритетам образовательной политики Китая.</w:t>
+      </w:r>
+      <w:r>
+        <w:rPr>
+          <w:color w:val="3D3735"/>
+        </w:rPr>
+        <w:t xml:space="preserve"> Рекомендуется для крупных образовательных организаций, работающих над государственными образовательными </w:t>
+      </w:r>
+      <w:r>
+        <w:rPr>
+          <w:color w:val="3D3735"/>
+        </w:rPr>
         <w:lastRenderedPageBreak/>
-        <w:t>2.5. Национальная платформа интеллектуального образования</w:t>
-      </w:r>
-      <w:bookmarkEnd w:id="8"/>
-    </w:p>
-    <w:p>
-      <w:pPr>
-        <w:spacing w:line="360" w:lineRule="auto"/>
-        <w:ind w:firstLine="709"/>
-        <w:jc w:val="both"/>
-        <w:rPr>
-          <w:color w:val="3D3735"/>
-        </w:rPr>
-      </w:pPr>
-      <w:r>
-        <w:rPr>
-          <w:b/>
-          <w:bCs/>
-          <w:color w:val="3D3735"/>
-        </w:rPr>
-        <w:t xml:space="preserve">Национальная платформа интеллектуального образования Китая (National Smart Education Platform </w:t>
-      </w:r>
-      <w:proofErr w:type="spellStart"/>
-      <w:r>
-        <w:rPr>
-          <w:b/>
-          <w:bCs/>
-          <w:color w:val="3D3735"/>
-        </w:rPr>
-        <w:t>of</w:t>
-      </w:r>
-      <w:proofErr w:type="spellEnd"/>
-      <w:r>
-        <w:rPr>
-          <w:b/>
-          <w:bCs/>
-          <w:color w:val="3D3735"/>
-        </w:rPr>
-        <w:t xml:space="preserve"> China)</w:t>
-      </w:r>
-      <w:r>
-        <w:rPr>
-          <w:color w:val="3D3735"/>
-        </w:rPr>
-        <w:t xml:space="preserve"> — комплексная государственная платформа, предоставляющая публичные образовательные услуги.</w:t>
-      </w:r>
-    </w:p>
-    <w:p>
-      <w:pPr>
-        <w:spacing w:line="360" w:lineRule="auto"/>
-        <w:ind w:firstLine="709"/>
-        <w:jc w:val="both"/>
-        <w:rPr>
-          <w:color w:val="3D3735"/>
-        </w:rPr>
-      </w:pPr>
-    </w:p>
-    <w:p>
-      <w:pPr>
-        <w:spacing w:line="360" w:lineRule="auto"/>
-        <w:ind w:firstLine="709"/>
-        <w:jc w:val="both"/>
-        <w:rPr>
-          <w:color w:val="3D3735"/>
-        </w:rPr>
-      </w:pPr>
-      <w:r>
-        <w:rPr>
-          <w:color w:val="3D3735"/>
-        </w:rPr>
-        <w:t xml:space="preserve">Платформа стала лауреатом премии </w:t>
-      </w:r>
-      <w:r>
-        <w:rPr>
-          <w:b/>
-          <w:bCs/>
-          <w:color w:val="3D3735"/>
-        </w:rPr>
-        <w:t>ЮНЕСКО</w:t>
-      </w:r>
-      <w:r>
-        <w:rPr>
-          <w:color w:val="3D3735"/>
-        </w:rPr>
-        <w:t xml:space="preserve"> за использование </w:t>
-      </w:r>
-      <w:r>
-        <w:rPr>
-          <w:b/>
-          <w:bCs/>
-          <w:color w:val="3D3735"/>
-        </w:rPr>
-        <w:t>ИКТ</w:t>
-      </w:r>
-      <w:r>
-        <w:rPr>
-          <w:color w:val="3D3735"/>
-        </w:rPr>
-        <w:t xml:space="preserve"> в образовании, что подтверждает её международное признание и соответствие высоким стандартам качества.</w:t>
-      </w:r>
-    </w:p>
-    <w:p>
-      <w:pPr>
-        <w:spacing w:line="360" w:lineRule="auto"/>
-        <w:ind w:firstLine="709"/>
-        <w:jc w:val="both"/>
-        <w:rPr>
-          <w:color w:val="3D3735"/>
-        </w:rPr>
-      </w:pPr>
-    </w:p>
-    <w:p>
-      <w:pPr>
-        <w:spacing w:line="360" w:lineRule="auto"/>
-        <w:ind w:firstLine="709"/>
-        <w:jc w:val="both"/>
-        <w:rPr>
-          <w:color w:val="3D3735"/>
-        </w:rPr>
-      </w:pPr>
-      <w:r>
-        <w:rPr>
-          <w:b/>
-          <w:bCs/>
-          <w:color w:val="3D3735"/>
-        </w:rPr>
-        <w:t>Создание платформы осуществлено при поддержке Министерства образования КНР.</w:t>
-      </w:r>
-    </w:p>
-    <w:p/>
-    <w:p>
-      <w:pPr>
-        <w:spacing w:line="360" w:lineRule="auto"/>
-        <w:ind w:firstLine="709"/>
-        <w:jc w:val="both"/>
-        <w:rPr>
-          <w:color w:val="3D3735"/>
-        </w:rPr>
-      </w:pPr>
-      <w:r>
-        <w:rPr>
-          <w:b/>
-          <w:bCs/>
-          <w:color w:val="3D3735"/>
-        </w:rPr>
-        <w:t>Стратегическая цель платформы</w:t>
-      </w:r>
-      <w:r>
-        <w:rPr>
-          <w:color w:val="3D3735"/>
-        </w:rPr>
-        <w:t xml:space="preserve"> — сокращение разрыва в доступе к качественному образованию между городскими и сельскими районами страны.</w:t>
-      </w:r>
-    </w:p>
-    <w:p>
-      <w:pPr>
-        <w:spacing w:line="360" w:lineRule="auto"/>
-        <w:ind w:firstLine="709"/>
-        <w:jc w:val="both"/>
-        <w:rPr>
-          <w:color w:val="3D3735"/>
-          <w:lang w:val="en-US"/>
-        </w:rPr>
-      </w:pPr>
-    </w:p>
-    <w:p>
-      <w:pPr>
-        <w:spacing w:line="360" w:lineRule="auto"/>
-        <w:ind w:firstLine="709"/>
-        <w:jc w:val="both"/>
-      </w:pPr>
-      <w:r>
-        <w:rPr>
-          <w:color w:val="3D3735"/>
-        </w:rPr>
-        <w:t xml:space="preserve">Платформа предоставляет обширную библиотеку ресурсов, включая материалы для профессионального образования и развития навыков </w:t>
-      </w:r>
-      <w:r>
-        <w:rPr>
-          <w:b/>
-          <w:bCs/>
-          <w:color w:val="3D3735"/>
-        </w:rPr>
-        <w:t xml:space="preserve">(TVET — </w:t>
-      </w:r>
-      <w:proofErr w:type="spellStart"/>
-      <w:r>
-        <w:rPr>
-          <w:b/>
-          <w:bCs/>
-          <w:color w:val="3D3735"/>
-        </w:rPr>
-        <w:t>Technical</w:t>
-      </w:r>
-      <w:proofErr w:type="spellEnd"/>
-      <w:r>
-        <w:rPr>
-          <w:b/>
-          <w:bCs/>
-          <w:color w:val="3D3735"/>
-        </w:rPr>
-        <w:t xml:space="preserve"> </w:t>
-      </w:r>
-      <w:proofErr w:type="spellStart"/>
-      <w:r>
-        <w:rPr>
-          <w:b/>
-          <w:bCs/>
-          <w:color w:val="3D3735"/>
-        </w:rPr>
-        <w:t>and</w:t>
-      </w:r>
-      <w:proofErr w:type="spellEnd"/>
-      <w:r>
-        <w:rPr>
-          <w:b/>
-          <w:bCs/>
-          <w:color w:val="3D3735"/>
-        </w:rPr>
-        <w:t xml:space="preserve"> </w:t>
-      </w:r>
-      <w:proofErr w:type="spellStart"/>
-      <w:r>
-        <w:rPr>
-          <w:b/>
-          <w:bCs/>
-          <w:color w:val="3D3735"/>
-        </w:rPr>
-        <w:t>Vocational</w:t>
-      </w:r>
-      <w:proofErr w:type="spellEnd"/>
-      <w:r>
-        <w:rPr>
-          <w:b/>
-          <w:bCs/>
-          <w:color w:val="3D3735"/>
-        </w:rPr>
-        <w:t xml:space="preserve"> Education </w:t>
-      </w:r>
-      <w:proofErr w:type="spellStart"/>
-      <w:r>
-        <w:rPr>
-          <w:b/>
-          <w:bCs/>
-          <w:color w:val="3D3735"/>
-        </w:rPr>
-        <w:t>and</w:t>
-      </w:r>
-      <w:proofErr w:type="spellEnd"/>
-      <w:r>
-        <w:rPr>
-          <w:b/>
-          <w:bCs/>
-          <w:color w:val="3D3735"/>
-        </w:rPr>
-        <w:t xml:space="preserve"> </w:t>
-      </w:r>
-      <w:proofErr w:type="spellStart"/>
-      <w:r>
-        <w:rPr>
-          <w:b/>
-          <w:bCs/>
-          <w:color w:val="3D3735"/>
-        </w:rPr>
-        <w:t>Training</w:t>
-      </w:r>
-      <w:proofErr w:type="spellEnd"/>
-      <w:r>
-        <w:rPr>
-          <w:b/>
-          <w:bCs/>
-          <w:color w:val="3D3735"/>
-        </w:rPr>
-        <w:t>)</w:t>
-      </w:r>
-      <w:r>
-        <w:rPr>
-          <w:color w:val="3D3735"/>
-        </w:rPr>
-        <w:t>. Особое внимание уделяется поддержке учителей и повышению их цифровой грамотности.</w:t>
-      </w:r>
-    </w:p>
-    <w:p>
-      <w:pPr>
-        <w:spacing w:line="360" w:lineRule="auto"/>
-        <w:ind w:firstLine="709"/>
-        <w:jc w:val="both"/>
-        <w:rPr>
-          <w:color w:val="3D3735"/>
-          <w:lang w:val="en-US"/>
-        </w:rPr>
-      </w:pPr>
-    </w:p>
-    <w:p>
-      <w:pPr>
-        <w:spacing w:line="360" w:lineRule="auto"/>
-        <w:ind w:firstLine="709"/>
-        <w:jc w:val="both"/>
-        <w:rPr>
-          <w:color w:val="3D3735"/>
-        </w:rPr>
-      </w:pPr>
-      <w:r>
-        <w:rPr>
-          <w:b/>
-          <w:bCs/>
-          <w:color w:val="3D3735"/>
-        </w:rPr>
-        <w:t>Платформа функционирует в основном как агрегатор государственного и аккредитованного контента.</w:t>
-      </w:r>
-      <w:r>
-        <w:rPr>
-          <w:color w:val="3D3735"/>
-        </w:rPr>
-        <w:t xml:space="preserve"> Публикация материалов возможна через участие в государственных программах и конкурсах Министерства образования.</w:t>
-      </w:r>
-    </w:p>
-    <w:p>
-      <w:pPr>
-        <w:spacing w:line="360" w:lineRule="auto"/>
-        <w:ind w:firstLine="709"/>
-        <w:jc w:val="both"/>
-        <w:rPr>
-          <w:color w:val="3D3735"/>
-          <w:lang w:val="en-US"/>
-        </w:rPr>
-      </w:pPr>
-    </w:p>
-    <w:p>
-      <w:pPr>
-        <w:spacing w:line="360" w:lineRule="auto"/>
-        <w:ind w:firstLine="709"/>
-        <w:jc w:val="both"/>
-      </w:pPr>
-      <w:r>
-        <w:rPr>
-          <w:b/>
-          <w:bCs/>
-          <w:color w:val="3D3735"/>
-        </w:rPr>
-        <w:t>Требуется соответствие государственным образовательным стандартам и приоритетам образовательной политики Китая.</w:t>
-      </w:r>
-      <w:r>
-        <w:rPr>
-          <w:color w:val="3D3735"/>
-        </w:rPr>
-        <w:t xml:space="preserve"> Рекомендуется для крупных образовательных организаций, работающих над государственными образовательными проектами, или авторов, чей контент может быть включён в государственные программы.</w:t>
+        <w:t>проектами, или авторов, чей контент может быть включён в государственные программы.</w:t>
       </w:r>
     </w:p>
     <w:p>
@@ -3476,7 +3899,13 @@
       </w:r>
       <w:bookmarkEnd w:id="9"/>
     </w:p>
-    <w:p/>
+    <w:p>
+      <w:pPr>
+        <w:spacing w:line="360" w:lineRule="auto"/>
+        <w:ind w:firstLine="709"/>
+        <w:jc w:val="both"/>
+      </w:pPr>
+    </w:p>
     <w:p>
       <w:pPr>
         <w:spacing w:line="360" w:lineRule="auto"/>
@@ -3533,7 +3962,13 @@
         <w:t>.</w:t>
       </w:r>
     </w:p>
-    <w:p/>
+    <w:p>
+      <w:pPr>
+        <w:spacing w:line="360" w:lineRule="auto"/>
+        <w:ind w:firstLine="709"/>
+        <w:jc w:val="both"/>
+      </w:pPr>
+    </w:p>
     <w:p>
       <w:pPr>
         <w:spacing w:before="100" w:after="300"/>
@@ -4344,7 +4779,13 @@
       </w:r>
       <w:bookmarkEnd w:id="10"/>
     </w:p>
-    <w:p/>
+    <w:p>
+      <w:pPr>
+        <w:spacing w:line="360" w:lineRule="auto"/>
+        <w:ind w:firstLine="709"/>
+        <w:jc w:val="both"/>
+      </w:pPr>
+    </w:p>
     <w:p>
       <w:pPr>
         <w:pStyle w:val="2"/>
@@ -4630,7 +5071,41 @@
     <w:p>
       <w:pPr>
         <w:spacing w:line="360" w:lineRule="auto"/>
-        <w:jc w:val="both"/>
+        <w:ind w:left="708"/>
+        <w:jc w:val="both"/>
+        <w:rPr>
+          <w:lang w:val="en-US"/>
+        </w:rPr>
+      </w:pPr>
+    </w:p>
+    <w:p>
+      <w:pPr>
+        <w:spacing w:line="360" w:lineRule="auto"/>
+        <w:ind w:left="708"/>
+        <w:jc w:val="both"/>
+        <w:rPr>
+          <w:lang w:val="en-US"/>
+        </w:rPr>
+      </w:pPr>
+    </w:p>
+    <w:p>
+      <w:pPr>
+        <w:spacing w:line="360" w:lineRule="auto"/>
+        <w:ind w:left="708"/>
+        <w:jc w:val="both"/>
+        <w:rPr>
+          <w:lang w:val="en-US"/>
+        </w:rPr>
+      </w:pPr>
+    </w:p>
+    <w:p>
+      <w:pPr>
+        <w:spacing w:line="360" w:lineRule="auto"/>
+        <w:ind w:left="708"/>
+        <w:jc w:val="both"/>
+        <w:rPr>
+          <w:lang w:val="en-US"/>
+        </w:rPr>
       </w:pPr>
     </w:p>
     <w:p>
@@ -4642,6 +5117,7 @@
       </w:pPr>
       <w:bookmarkStart w:id="12" w:name="_Toc224571163"/>
       <w:r>
+        <w:lastRenderedPageBreak/>
         <w:t>4.2. Локализация и адаптация контента</w:t>
       </w:r>
       <w:bookmarkEnd w:id="12"/>
@@ -4661,7 +5137,6 @@
           <w:bCs/>
           <w:color w:val="3D3735"/>
         </w:rPr>
-        <w:lastRenderedPageBreak/>
         <w:t>Локализация контента</w:t>
       </w:r>
       <w:r>
@@ -4755,6 +5230,7 @@
         <w:jc w:val="both"/>
         <w:rPr>
           <w:color w:val="3D3735"/>
+          <w:lang w:val="en-US"/>
         </w:rPr>
       </w:pPr>
       <w:r>
@@ -4775,7 +5251,12 @@
     <w:p>
       <w:pPr>
         <w:spacing w:line="360" w:lineRule="auto"/>
-        <w:jc w:val="both"/>
+        <w:ind w:firstLine="709"/>
+        <w:jc w:val="both"/>
+        <w:rPr>
+          <w:color w:val="3D3735"/>
+          <w:lang w:val="en-US"/>
+        </w:rPr>
       </w:pPr>
     </w:p>
     <w:p>
@@ -4811,9 +5292,15 @@
         <w:rPr>
           <w:color w:val="3D3735"/>
         </w:rPr>
-        <w:t>digital-ландшафта.</w:t>
+        <w:t>digital</w:t>
       </w:r>
       <w:proofErr w:type="spellEnd"/>
+      <w:r>
+        <w:rPr>
+          <w:color w:val="3D3735"/>
+        </w:rPr>
+        <w:t>-ландшафта.</w:t>
+      </w:r>
     </w:p>
     <w:p>
       <w:pPr>
@@ -4956,6 +5443,7 @@
           <w:bCs/>
           <w:color w:val="3D3735"/>
         </w:rPr>
+        <w:lastRenderedPageBreak/>
         <w:t>Китайские социальные сети</w:t>
       </w:r>
       <w:r>
@@ -5024,7 +5512,6 @@
           <w:bCs/>
           <w:color w:val="3D3735"/>
         </w:rPr>
-        <w:lastRenderedPageBreak/>
         <w:t>Сотрудничество с местными экспертами</w:t>
       </w:r>
       <w:r>
@@ -5060,7 +5547,15 @@
         <w:t xml:space="preserve"> — постоянное улучшение курса на основе отзывов и данных аналитики платформы</w:t>
       </w:r>
     </w:p>
-    <w:p/>
+    <w:p>
+      <w:pPr>
+        <w:ind w:left="708"/>
+        <w:jc w:val="both"/>
+        <w:rPr>
+          <w:lang w:val="en-US"/>
+        </w:rPr>
+      </w:pPr>
+    </w:p>
     <w:p>
       <w:pPr>
         <w:pStyle w:val="2"/>
@@ -5090,7 +5585,16 @@
         <w:t>При выходе на китайский образовательный рынок авторы часто допускают типичные ошибки, которые могут значительно снизить эффективность публикации курса.</w:t>
       </w:r>
     </w:p>
-    <w:p/>
+    <w:p>
+      <w:pPr>
+        <w:spacing w:line="360" w:lineRule="auto"/>
+        <w:ind w:firstLine="709"/>
+        <w:jc w:val="both"/>
+        <w:rPr>
+          <w:lang w:val="en-US"/>
+        </w:rPr>
+      </w:pPr>
+    </w:p>
     <w:p>
       <w:pPr>
         <w:spacing w:line="360" w:lineRule="auto"/>
@@ -5107,7 +5611,13 @@
         <w:t>Понимание этих ошибок и способов их предотвращения поможет избежать распространённых проблем и повысить шансы на успех.</w:t>
       </w:r>
     </w:p>
-    <w:p/>
+    <w:p>
+      <w:pPr>
+        <w:spacing w:line="360" w:lineRule="auto"/>
+        <w:ind w:firstLine="709"/>
+        <w:jc w:val="both"/>
+      </w:pPr>
+    </w:p>
     <w:p>
       <w:pPr>
         <w:spacing w:before="100" w:after="300"/>
@@ -5509,7 +6019,13 @@
         <w:t>ИТОГОВЫЕ ВЫВОДЫ</w:t>
       </w:r>
     </w:p>
-    <w:p/>
+    <w:p>
+      <w:pPr>
+        <w:spacing w:line="360" w:lineRule="auto"/>
+        <w:ind w:firstLine="709"/>
+        <w:jc w:val="both"/>
+      </w:pPr>
+    </w:p>
     <w:p>
       <w:pPr>
         <w:spacing w:line="360" w:lineRule="auto"/>
@@ -5756,6 +6272,8 @@
     </w:p>
     <w:p>
       <w:pPr>
+        <w:spacing w:line="360" w:lineRule="auto"/>
+        <w:ind w:firstLine="709"/>
         <w:jc w:val="both"/>
       </w:pPr>
     </w:p>
@@ -5766,7 +6284,8 @@
           <w:ilvl w:val="0"/>
           <w:numId w:val="4"/>
         </w:numPr>
-        <w:spacing w:line="346" w:lineRule="auto"/>
+        <w:spacing w:line="360" w:lineRule="auto"/>
+        <w:ind w:left="0" w:firstLine="709"/>
         <w:jc w:val="both"/>
       </w:pPr>
       <w:proofErr w:type="spellStart"/>
@@ -5823,7 +6342,8 @@
           <w:ilvl w:val="0"/>
           <w:numId w:val="4"/>
         </w:numPr>
-        <w:spacing w:line="346" w:lineRule="auto"/>
+        <w:spacing w:line="360" w:lineRule="auto"/>
+        <w:ind w:left="0" w:firstLine="709"/>
         <w:jc w:val="both"/>
         <w:rPr>
           <w:lang w:val="en-US"/>
@@ -5857,7 +6377,8 @@
           <w:ilvl w:val="0"/>
           <w:numId w:val="4"/>
         </w:numPr>
-        <w:spacing w:line="346" w:lineRule="auto"/>
+        <w:spacing w:line="360" w:lineRule="auto"/>
+        <w:ind w:left="0" w:firstLine="709"/>
         <w:jc w:val="both"/>
       </w:pPr>
       <w:r>
@@ -5885,7 +6406,8 @@
           <w:ilvl w:val="0"/>
           <w:numId w:val="4"/>
         </w:numPr>
-        <w:spacing w:line="346" w:lineRule="auto"/>
+        <w:spacing w:line="360" w:lineRule="auto"/>
+        <w:ind w:left="0" w:firstLine="709"/>
         <w:jc w:val="both"/>
         <w:rPr>
           <w:lang w:val="en-US"/>
@@ -5919,7 +6441,8 @@
           <w:ilvl w:val="0"/>
           <w:numId w:val="4"/>
         </w:numPr>
-        <w:spacing w:line="346" w:lineRule="auto"/>
+        <w:spacing w:line="360" w:lineRule="auto"/>
+        <w:ind w:left="0" w:firstLine="709"/>
         <w:jc w:val="both"/>
       </w:pPr>
       <w:r>
@@ -5947,7 +6470,8 @@
           <w:ilvl w:val="0"/>
           <w:numId w:val="4"/>
         </w:numPr>
-        <w:spacing w:line="346" w:lineRule="auto"/>
+        <w:spacing w:line="360" w:lineRule="auto"/>
+        <w:ind w:left="0" w:firstLine="709"/>
         <w:jc w:val="both"/>
       </w:pPr>
       <w:r>
@@ -6005,7 +6529,8 @@
           <w:ilvl w:val="0"/>
           <w:numId w:val="4"/>
         </w:numPr>
-        <w:spacing w:line="346" w:lineRule="auto"/>
+        <w:spacing w:line="360" w:lineRule="auto"/>
+        <w:ind w:left="0" w:firstLine="709"/>
         <w:jc w:val="both"/>
       </w:pPr>
       <w:proofErr w:type="spellStart"/>
@@ -6044,7 +6569,8 @@
           <w:ilvl w:val="0"/>
           <w:numId w:val="4"/>
         </w:numPr>
-        <w:spacing w:line="346" w:lineRule="auto"/>
+        <w:spacing w:line="360" w:lineRule="auto"/>
+        <w:ind w:left="0" w:firstLine="709"/>
         <w:jc w:val="both"/>
       </w:pPr>
       <w:r>
@@ -6072,7 +6598,8 @@
           <w:ilvl w:val="0"/>
           <w:numId w:val="4"/>
         </w:numPr>
-        <w:spacing w:line="346" w:lineRule="auto"/>
+        <w:spacing w:line="360" w:lineRule="auto"/>
+        <w:ind w:left="0" w:firstLine="709"/>
         <w:jc w:val="both"/>
         <w:rPr>
           <w:lang w:val="en-US"/>
@@ -6095,7 +6622,8 @@
           <w:ilvl w:val="0"/>
           <w:numId w:val="4"/>
         </w:numPr>
-        <w:spacing w:line="346" w:lineRule="auto"/>
+        <w:spacing w:line="360" w:lineRule="auto"/>
+        <w:ind w:left="0" w:firstLine="709"/>
         <w:jc w:val="both"/>
       </w:pPr>
       <w:r>
@@ -6118,7 +6646,8 @@
     </w:p>
     <w:p>
       <w:pPr>
-        <w:spacing w:line="346" w:lineRule="auto"/>
+        <w:spacing w:line="360" w:lineRule="auto"/>
+        <w:ind w:firstLine="709"/>
         <w:jc w:val="both"/>
       </w:pPr>
     </w:p>
@@ -6179,8 +6708,8 @@
       </w:r>
     </w:p>
     <w:sectPr>
-      <w:headerReference w:type="default" r:id="rId10"/>
-      <w:footerReference w:type="default" r:id="rId11"/>
+      <w:headerReference w:type="default" r:id="rId11"/>
+      <w:footerReference w:type="default" r:id="rId12"/>
       <w:pgSz w:w="11906" w:h="16838"/>
       <w:pgMar w:top="1800" w:right="1440" w:bottom="1440" w:left="1440" w:header="708" w:footer="708" w:gutter="0"/>
       <w:cols w:space="720"/>
@@ -7680,4 +8209,16 @@
     </a:ext>
   </a:extLst>
 </a:theme>
+</file>
+
+<file path=customXml/item1.xml><?xml version="1.0" encoding="utf-8"?>
+<b:Sources xmlns:b="http://schemas.openxmlformats.org/officeDocument/2006/bibliography" xmlns="http://schemas.openxmlformats.org/officeDocument/2006/bibliography" SelectedStyle="\APASixthEditionOfficeOnline.xsl" StyleName="APA" Version="6"/>
+</file>
+
+<file path=customXml/itemProps1.xml><?xml version="1.0" encoding="utf-8"?>
+<ds:datastoreItem xmlns:ds="http://schemas.openxmlformats.org/officeDocument/2006/customXml" ds:itemID="{DD111EFA-11D6-47E9-8FDF-E8A57296544B}">
+  <ds:schemaRefs>
+    <ds:schemaRef ds:uri="http://schemas.openxmlformats.org/officeDocument/2006/bibliography"/>
+  </ds:schemaRefs>
+</ds:datastoreItem>
 </file>
</xml_diff>